<commit_message>
Sync thesis figures and demo evidence
</commit_message>
<xml_diff>
--- a/thesis-assets/毕业论文正式版（草稿）.docx
+++ b/thesis-assets/毕业论文正式版（草稿）.docx
@@ -8,7 +8,6 @@
         <w:ind w:firstLine="0"/>
         <w:jc w:val="center"/>
       </w:pPr>
-      <w:bookmarkStart w:id="46" w:name="_GoBack"/>
       <w:r>
         <w:drawing>
           <wp:inline distT="0" distB="0" distL="114300" distR="114300">
@@ -904,7 +903,7 @@
             <w:fldChar w:fldCharType="begin"/>
           </w:r>
           <w:r>
-            <w:instrText xml:space="preserve"> HYPERLINK \l _Toc16956 </w:instrText>
+            <w:instrText xml:space="preserve"> HYPERLINK \l _Toc12533 </w:instrText>
           </w:r>
           <w:r>
             <w:fldChar w:fldCharType="separate"/>
@@ -922,7 +921,7 @@
             <w:fldChar w:fldCharType="begin"/>
           </w:r>
           <w:r>
-            <w:instrText xml:space="preserve"> PAGEREF _Toc16956 \h </w:instrText>
+            <w:instrText xml:space="preserve"> PAGEREF _Toc12533 \h </w:instrText>
           </w:r>
           <w:r>
             <w:fldChar w:fldCharType="separate"/>
@@ -945,7 +944,7 @@
             <w:fldChar w:fldCharType="begin"/>
           </w:r>
           <w:r>
-            <w:instrText xml:space="preserve"> HYPERLINK \l _Toc18011 </w:instrText>
+            <w:instrText xml:space="preserve"> HYPERLINK \l _Toc14575 </w:instrText>
           </w:r>
           <w:r>
             <w:fldChar w:fldCharType="separate"/>
@@ -963,7 +962,7 @@
             <w:fldChar w:fldCharType="begin"/>
           </w:r>
           <w:r>
-            <w:instrText xml:space="preserve"> PAGEREF _Toc18011 \h </w:instrText>
+            <w:instrText xml:space="preserve"> PAGEREF _Toc14575 \h </w:instrText>
           </w:r>
           <w:r>
             <w:fldChar w:fldCharType="separate"/>
@@ -986,7 +985,7 @@
             <w:fldChar w:fldCharType="begin"/>
           </w:r>
           <w:r>
-            <w:instrText xml:space="preserve"> HYPERLINK \l _Toc3625 </w:instrText>
+            <w:instrText xml:space="preserve"> HYPERLINK \l _Toc1850 </w:instrText>
           </w:r>
           <w:r>
             <w:fldChar w:fldCharType="separate"/>
@@ -1004,7 +1003,7 @@
             <w:fldChar w:fldCharType="begin"/>
           </w:r>
           <w:r>
-            <w:instrText xml:space="preserve"> PAGEREF _Toc3625 \h </w:instrText>
+            <w:instrText xml:space="preserve"> PAGEREF _Toc1850 \h </w:instrText>
           </w:r>
           <w:r>
             <w:fldChar w:fldCharType="separate"/>
@@ -1031,7 +1030,7 @@
             <w:fldChar w:fldCharType="begin"/>
           </w:r>
           <w:r>
-            <w:instrText xml:space="preserve"> HYPERLINK \l _Toc32497 </w:instrText>
+            <w:instrText xml:space="preserve"> HYPERLINK \l _Toc14878 </w:instrText>
           </w:r>
           <w:r>
             <w:fldChar w:fldCharType="separate"/>
@@ -1049,7 +1048,7 @@
             <w:fldChar w:fldCharType="begin"/>
           </w:r>
           <w:r>
-            <w:instrText xml:space="preserve"> PAGEREF _Toc32497 \h </w:instrText>
+            <w:instrText xml:space="preserve"> PAGEREF _Toc14878 \h </w:instrText>
           </w:r>
           <w:r>
             <w:fldChar w:fldCharType="separate"/>
@@ -1076,7 +1075,7 @@
             <w:fldChar w:fldCharType="begin"/>
           </w:r>
           <w:r>
-            <w:instrText xml:space="preserve"> HYPERLINK \l _Toc17902 </w:instrText>
+            <w:instrText xml:space="preserve"> HYPERLINK \l _Toc5848 </w:instrText>
           </w:r>
           <w:r>
             <w:fldChar w:fldCharType="separate"/>
@@ -1094,7 +1093,7 @@
             <w:fldChar w:fldCharType="begin"/>
           </w:r>
           <w:r>
-            <w:instrText xml:space="preserve"> PAGEREF _Toc17902 \h </w:instrText>
+            <w:instrText xml:space="preserve"> PAGEREF _Toc5848 \h </w:instrText>
           </w:r>
           <w:r>
             <w:fldChar w:fldCharType="separate"/>
@@ -1121,7 +1120,7 @@
             <w:fldChar w:fldCharType="begin"/>
           </w:r>
           <w:r>
-            <w:instrText xml:space="preserve"> HYPERLINK \l _Toc3880 </w:instrText>
+            <w:instrText xml:space="preserve"> HYPERLINK \l _Toc29804 </w:instrText>
           </w:r>
           <w:r>
             <w:fldChar w:fldCharType="separate"/>
@@ -1139,7 +1138,7 @@
             <w:fldChar w:fldCharType="begin"/>
           </w:r>
           <w:r>
-            <w:instrText xml:space="preserve"> PAGEREF _Toc3880 \h </w:instrText>
+            <w:instrText xml:space="preserve"> PAGEREF _Toc29804 \h </w:instrText>
           </w:r>
           <w:r>
             <w:fldChar w:fldCharType="separate"/>
@@ -1166,7 +1165,7 @@
             <w:fldChar w:fldCharType="begin"/>
           </w:r>
           <w:r>
-            <w:instrText xml:space="preserve"> HYPERLINK \l _Toc23126 </w:instrText>
+            <w:instrText xml:space="preserve"> HYPERLINK \l _Toc17559 </w:instrText>
           </w:r>
           <w:r>
             <w:fldChar w:fldCharType="separate"/>
@@ -1184,7 +1183,7 @@
             <w:fldChar w:fldCharType="begin"/>
           </w:r>
           <w:r>
-            <w:instrText xml:space="preserve"> PAGEREF _Toc23126 \h </w:instrText>
+            <w:instrText xml:space="preserve"> PAGEREF _Toc17559 \h </w:instrText>
           </w:r>
           <w:r>
             <w:fldChar w:fldCharType="separate"/>
@@ -1207,7 +1206,7 @@
             <w:fldChar w:fldCharType="begin"/>
           </w:r>
           <w:r>
-            <w:instrText xml:space="preserve"> HYPERLINK \l _Toc16363 </w:instrText>
+            <w:instrText xml:space="preserve"> HYPERLINK \l _Toc3282 </w:instrText>
           </w:r>
           <w:r>
             <w:fldChar w:fldCharType="separate"/>
@@ -1225,7 +1224,7 @@
             <w:fldChar w:fldCharType="begin"/>
           </w:r>
           <w:r>
-            <w:instrText xml:space="preserve"> PAGEREF _Toc16363 \h </w:instrText>
+            <w:instrText xml:space="preserve"> PAGEREF _Toc3282 \h </w:instrText>
           </w:r>
           <w:r>
             <w:fldChar w:fldCharType="separate"/>
@@ -1252,7 +1251,7 @@
             <w:fldChar w:fldCharType="begin"/>
           </w:r>
           <w:r>
-            <w:instrText xml:space="preserve"> HYPERLINK \l _Toc18113 </w:instrText>
+            <w:instrText xml:space="preserve"> HYPERLINK \l _Toc28570 </w:instrText>
           </w:r>
           <w:r>
             <w:fldChar w:fldCharType="separate"/>
@@ -1270,7 +1269,7 @@
             <w:fldChar w:fldCharType="begin"/>
           </w:r>
           <w:r>
-            <w:instrText xml:space="preserve"> PAGEREF _Toc18113 \h </w:instrText>
+            <w:instrText xml:space="preserve"> PAGEREF _Toc28570 \h </w:instrText>
           </w:r>
           <w:r>
             <w:fldChar w:fldCharType="separate"/>
@@ -1297,7 +1296,7 @@
             <w:fldChar w:fldCharType="begin"/>
           </w:r>
           <w:r>
-            <w:instrText xml:space="preserve"> HYPERLINK \l _Toc9393 </w:instrText>
+            <w:instrText xml:space="preserve"> HYPERLINK \l _Toc9163 </w:instrText>
           </w:r>
           <w:r>
             <w:fldChar w:fldCharType="separate"/>
@@ -1315,7 +1314,7 @@
             <w:fldChar w:fldCharType="begin"/>
           </w:r>
           <w:r>
-            <w:instrText xml:space="preserve"> PAGEREF _Toc9393 \h </w:instrText>
+            <w:instrText xml:space="preserve"> PAGEREF _Toc9163 \h </w:instrText>
           </w:r>
           <w:r>
             <w:fldChar w:fldCharType="separate"/>
@@ -1342,7 +1341,7 @@
             <w:fldChar w:fldCharType="begin"/>
           </w:r>
           <w:r>
-            <w:instrText xml:space="preserve"> HYPERLINK \l _Toc10232 </w:instrText>
+            <w:instrText xml:space="preserve"> HYPERLINK \l _Toc1223 </w:instrText>
           </w:r>
           <w:r>
             <w:fldChar w:fldCharType="separate"/>
@@ -1360,7 +1359,7 @@
             <w:fldChar w:fldCharType="begin"/>
           </w:r>
           <w:r>
-            <w:instrText xml:space="preserve"> PAGEREF _Toc10232 \h </w:instrText>
+            <w:instrText xml:space="preserve"> PAGEREF _Toc1223 \h </w:instrText>
           </w:r>
           <w:r>
             <w:fldChar w:fldCharType="separate"/>
@@ -1387,7 +1386,7 @@
             <w:fldChar w:fldCharType="begin"/>
           </w:r>
           <w:r>
-            <w:instrText xml:space="preserve"> HYPERLINK \l _Toc10633 </w:instrText>
+            <w:instrText xml:space="preserve"> HYPERLINK \l _Toc28567 </w:instrText>
           </w:r>
           <w:r>
             <w:fldChar w:fldCharType="separate"/>
@@ -1405,7 +1404,7 @@
             <w:fldChar w:fldCharType="begin"/>
           </w:r>
           <w:r>
-            <w:instrText xml:space="preserve"> PAGEREF _Toc10633 \h </w:instrText>
+            <w:instrText xml:space="preserve"> PAGEREF _Toc28567 \h </w:instrText>
           </w:r>
           <w:r>
             <w:fldChar w:fldCharType="separate"/>
@@ -1432,7 +1431,7 @@
             <w:fldChar w:fldCharType="begin"/>
           </w:r>
           <w:r>
-            <w:instrText xml:space="preserve"> HYPERLINK \l _Toc6807 </w:instrText>
+            <w:instrText xml:space="preserve"> HYPERLINK \l _Toc12941 </w:instrText>
           </w:r>
           <w:r>
             <w:fldChar w:fldCharType="separate"/>
@@ -1450,7 +1449,7 @@
             <w:fldChar w:fldCharType="begin"/>
           </w:r>
           <w:r>
-            <w:instrText xml:space="preserve"> PAGEREF _Toc6807 \h </w:instrText>
+            <w:instrText xml:space="preserve"> PAGEREF _Toc12941 \h </w:instrText>
           </w:r>
           <w:r>
             <w:fldChar w:fldCharType="separate"/>
@@ -1473,7 +1472,7 @@
             <w:fldChar w:fldCharType="begin"/>
           </w:r>
           <w:r>
-            <w:instrText xml:space="preserve"> HYPERLINK \l _Toc24158 </w:instrText>
+            <w:instrText xml:space="preserve"> HYPERLINK \l _Toc6505 </w:instrText>
           </w:r>
           <w:r>
             <w:fldChar w:fldCharType="separate"/>
@@ -1491,7 +1490,7 @@
             <w:fldChar w:fldCharType="begin"/>
           </w:r>
           <w:r>
-            <w:instrText xml:space="preserve"> PAGEREF _Toc24158 \h </w:instrText>
+            <w:instrText xml:space="preserve"> PAGEREF _Toc6505 \h </w:instrText>
           </w:r>
           <w:r>
             <w:fldChar w:fldCharType="separate"/>
@@ -1518,7 +1517,7 @@
             <w:fldChar w:fldCharType="begin"/>
           </w:r>
           <w:r>
-            <w:instrText xml:space="preserve"> HYPERLINK \l _Toc9643 </w:instrText>
+            <w:instrText xml:space="preserve"> HYPERLINK \l _Toc26570 </w:instrText>
           </w:r>
           <w:r>
             <w:fldChar w:fldCharType="separate"/>
@@ -1536,7 +1535,7 @@
             <w:fldChar w:fldCharType="begin"/>
           </w:r>
           <w:r>
-            <w:instrText xml:space="preserve"> PAGEREF _Toc9643 \h </w:instrText>
+            <w:instrText xml:space="preserve"> PAGEREF _Toc26570 \h </w:instrText>
           </w:r>
           <w:r>
             <w:fldChar w:fldCharType="separate"/>
@@ -1563,7 +1562,7 @@
             <w:fldChar w:fldCharType="begin"/>
           </w:r>
           <w:r>
-            <w:instrText xml:space="preserve"> HYPERLINK \l _Toc20875 </w:instrText>
+            <w:instrText xml:space="preserve"> HYPERLINK \l _Toc32060 </w:instrText>
           </w:r>
           <w:r>
             <w:fldChar w:fldCharType="separate"/>
@@ -1581,7 +1580,7 @@
             <w:fldChar w:fldCharType="begin"/>
           </w:r>
           <w:r>
-            <w:instrText xml:space="preserve"> PAGEREF _Toc20875 \h </w:instrText>
+            <w:instrText xml:space="preserve"> PAGEREF _Toc32060 \h </w:instrText>
           </w:r>
           <w:r>
             <w:fldChar w:fldCharType="separate"/>
@@ -1608,7 +1607,7 @@
             <w:fldChar w:fldCharType="begin"/>
           </w:r>
           <w:r>
-            <w:instrText xml:space="preserve"> HYPERLINK \l _Toc23428 </w:instrText>
+            <w:instrText xml:space="preserve"> HYPERLINK \l _Toc24277 </w:instrText>
           </w:r>
           <w:r>
             <w:fldChar w:fldCharType="separate"/>
@@ -1626,7 +1625,7 @@
             <w:fldChar w:fldCharType="begin"/>
           </w:r>
           <w:r>
-            <w:instrText xml:space="preserve"> PAGEREF _Toc23428 \h </w:instrText>
+            <w:instrText xml:space="preserve"> PAGEREF _Toc24277 \h </w:instrText>
           </w:r>
           <w:r>
             <w:fldChar w:fldCharType="separate"/>
@@ -1653,7 +1652,7 @@
             <w:fldChar w:fldCharType="begin"/>
           </w:r>
           <w:r>
-            <w:instrText xml:space="preserve"> HYPERLINK \l _Toc7168 </w:instrText>
+            <w:instrText xml:space="preserve"> HYPERLINK \l _Toc10536 </w:instrText>
           </w:r>
           <w:r>
             <w:fldChar w:fldCharType="separate"/>
@@ -1671,7 +1670,7 @@
             <w:fldChar w:fldCharType="begin"/>
           </w:r>
           <w:r>
-            <w:instrText xml:space="preserve"> PAGEREF _Toc7168 \h </w:instrText>
+            <w:instrText xml:space="preserve"> PAGEREF _Toc10536 \h </w:instrText>
           </w:r>
           <w:r>
             <w:fldChar w:fldCharType="separate"/>
@@ -1694,7 +1693,7 @@
             <w:fldChar w:fldCharType="begin"/>
           </w:r>
           <w:r>
-            <w:instrText xml:space="preserve"> HYPERLINK \l _Toc27077 </w:instrText>
+            <w:instrText xml:space="preserve"> HYPERLINK \l _Toc15876 </w:instrText>
           </w:r>
           <w:r>
             <w:fldChar w:fldCharType="separate"/>
@@ -1712,13 +1711,13 @@
             <w:fldChar w:fldCharType="begin"/>
           </w:r>
           <w:r>
-            <w:instrText xml:space="preserve"> PAGEREF _Toc27077 \h </w:instrText>
+            <w:instrText xml:space="preserve"> PAGEREF _Toc15876 \h </w:instrText>
           </w:r>
           <w:r>
             <w:fldChar w:fldCharType="separate"/>
           </w:r>
           <w:r>
-            <w:t>15</w:t>
+            <w:t>16</w:t>
           </w:r>
           <w:r>
             <w:fldChar w:fldCharType="end"/>
@@ -1739,7 +1738,7 @@
             <w:fldChar w:fldCharType="begin"/>
           </w:r>
           <w:r>
-            <w:instrText xml:space="preserve"> HYPERLINK \l _Toc4988 </w:instrText>
+            <w:instrText xml:space="preserve"> HYPERLINK \l _Toc8291 </w:instrText>
           </w:r>
           <w:r>
             <w:fldChar w:fldCharType="separate"/>
@@ -1757,13 +1756,13 @@
             <w:fldChar w:fldCharType="begin"/>
           </w:r>
           <w:r>
-            <w:instrText xml:space="preserve"> PAGEREF _Toc4988 \h </w:instrText>
+            <w:instrText xml:space="preserve"> PAGEREF _Toc8291 \h </w:instrText>
           </w:r>
           <w:r>
             <w:fldChar w:fldCharType="separate"/>
           </w:r>
           <w:r>
-            <w:t>15</w:t>
+            <w:t>16</w:t>
           </w:r>
           <w:r>
             <w:fldChar w:fldCharType="end"/>
@@ -1784,7 +1783,7 @@
             <w:fldChar w:fldCharType="begin"/>
           </w:r>
           <w:r>
-            <w:instrText xml:space="preserve"> HYPERLINK \l _Toc23347 </w:instrText>
+            <w:instrText xml:space="preserve"> HYPERLINK \l _Toc24861 </w:instrText>
           </w:r>
           <w:r>
             <w:fldChar w:fldCharType="separate"/>
@@ -1802,13 +1801,13 @@
             <w:fldChar w:fldCharType="begin"/>
           </w:r>
           <w:r>
-            <w:instrText xml:space="preserve"> PAGEREF _Toc23347 \h </w:instrText>
+            <w:instrText xml:space="preserve"> PAGEREF _Toc24861 \h </w:instrText>
           </w:r>
           <w:r>
             <w:fldChar w:fldCharType="separate"/>
           </w:r>
           <w:r>
-            <w:t>15</w:t>
+            <w:t>16</w:t>
           </w:r>
           <w:r>
             <w:fldChar w:fldCharType="end"/>
@@ -1829,7 +1828,7 @@
             <w:fldChar w:fldCharType="begin"/>
           </w:r>
           <w:r>
-            <w:instrText xml:space="preserve"> HYPERLINK \l _Toc31659 </w:instrText>
+            <w:instrText xml:space="preserve"> HYPERLINK \l _Toc18266 </w:instrText>
           </w:r>
           <w:r>
             <w:fldChar w:fldCharType="separate"/>
@@ -1847,13 +1846,13 @@
             <w:fldChar w:fldCharType="begin"/>
           </w:r>
           <w:r>
-            <w:instrText xml:space="preserve"> PAGEREF _Toc31659 \h </w:instrText>
+            <w:instrText xml:space="preserve"> PAGEREF _Toc18266 \h </w:instrText>
           </w:r>
           <w:r>
             <w:fldChar w:fldCharType="separate"/>
           </w:r>
           <w:r>
-            <w:t>16</w:t>
+            <w:t>17</w:t>
           </w:r>
           <w:r>
             <w:fldChar w:fldCharType="end"/>
@@ -1874,7 +1873,7 @@
             <w:fldChar w:fldCharType="begin"/>
           </w:r>
           <w:r>
-            <w:instrText xml:space="preserve"> HYPERLINK \l _Toc8412 </w:instrText>
+            <w:instrText xml:space="preserve"> HYPERLINK \l _Toc15251 </w:instrText>
           </w:r>
           <w:r>
             <w:fldChar w:fldCharType="separate"/>
@@ -1892,13 +1891,13 @@
             <w:fldChar w:fldCharType="begin"/>
           </w:r>
           <w:r>
-            <w:instrText xml:space="preserve"> PAGEREF _Toc8412 \h </w:instrText>
+            <w:instrText xml:space="preserve"> PAGEREF _Toc15251 \h </w:instrText>
           </w:r>
           <w:r>
             <w:fldChar w:fldCharType="separate"/>
           </w:r>
           <w:r>
-            <w:t>17</w:t>
+            <w:t>18</w:t>
           </w:r>
           <w:r>
             <w:fldChar w:fldCharType="end"/>
@@ -1919,7 +1918,7 @@
             <w:fldChar w:fldCharType="begin"/>
           </w:r>
           <w:r>
-            <w:instrText xml:space="preserve"> HYPERLINK \l _Toc5420 </w:instrText>
+            <w:instrText xml:space="preserve"> HYPERLINK \l _Toc18822 </w:instrText>
           </w:r>
           <w:r>
             <w:fldChar w:fldCharType="separate"/>
@@ -1937,13 +1936,13 @@
             <w:fldChar w:fldCharType="begin"/>
           </w:r>
           <w:r>
-            <w:instrText xml:space="preserve"> PAGEREF _Toc5420 \h </w:instrText>
+            <w:instrText xml:space="preserve"> PAGEREF _Toc18822 \h </w:instrText>
           </w:r>
           <w:r>
             <w:fldChar w:fldCharType="separate"/>
           </w:r>
           <w:r>
-            <w:t>18</w:t>
+            <w:t>19</w:t>
           </w:r>
           <w:r>
             <w:fldChar w:fldCharType="end"/>
@@ -1964,7 +1963,7 @@
             <w:fldChar w:fldCharType="begin"/>
           </w:r>
           <w:r>
-            <w:instrText xml:space="preserve"> HYPERLINK \l _Toc25989 </w:instrText>
+            <w:instrText xml:space="preserve"> HYPERLINK \l _Toc393 </w:instrText>
           </w:r>
           <w:r>
             <w:fldChar w:fldCharType="separate"/>
@@ -1982,13 +1981,13 @@
             <w:fldChar w:fldCharType="begin"/>
           </w:r>
           <w:r>
-            <w:instrText xml:space="preserve"> PAGEREF _Toc25989 \h </w:instrText>
+            <w:instrText xml:space="preserve"> PAGEREF _Toc393 \h </w:instrText>
           </w:r>
           <w:r>
             <w:fldChar w:fldCharType="separate"/>
           </w:r>
           <w:r>
-            <w:t>19</w:t>
+            <w:t>20</w:t>
           </w:r>
           <w:r>
             <w:fldChar w:fldCharType="end"/>
@@ -2009,7 +2008,7 @@
             <w:fldChar w:fldCharType="begin"/>
           </w:r>
           <w:r>
-            <w:instrText xml:space="preserve"> HYPERLINK \l _Toc8648 </w:instrText>
+            <w:instrText xml:space="preserve"> HYPERLINK \l _Toc3810 </w:instrText>
           </w:r>
           <w:r>
             <w:fldChar w:fldCharType="separate"/>
@@ -2027,13 +2026,13 @@
             <w:fldChar w:fldCharType="begin"/>
           </w:r>
           <w:r>
-            <w:instrText xml:space="preserve"> PAGEREF _Toc8648 \h </w:instrText>
+            <w:instrText xml:space="preserve"> PAGEREF _Toc3810 \h </w:instrText>
           </w:r>
           <w:r>
             <w:fldChar w:fldCharType="separate"/>
           </w:r>
           <w:r>
-            <w:t>19</w:t>
+            <w:t>20</w:t>
           </w:r>
           <w:r>
             <w:fldChar w:fldCharType="end"/>
@@ -2050,7 +2049,7 @@
             <w:fldChar w:fldCharType="begin"/>
           </w:r>
           <w:r>
-            <w:instrText xml:space="preserve"> HYPERLINK \l _Toc1416 </w:instrText>
+            <w:instrText xml:space="preserve"> HYPERLINK \l _Toc30176 </w:instrText>
           </w:r>
           <w:r>
             <w:fldChar w:fldCharType="separate"/>
@@ -2068,13 +2067,13 @@
             <w:fldChar w:fldCharType="begin"/>
           </w:r>
           <w:r>
-            <w:instrText xml:space="preserve"> PAGEREF _Toc1416 \h </w:instrText>
+            <w:instrText xml:space="preserve"> PAGEREF _Toc30176 \h </w:instrText>
           </w:r>
           <w:r>
             <w:fldChar w:fldCharType="separate"/>
           </w:r>
           <w:r>
-            <w:t>21</w:t>
+            <w:t>22</w:t>
           </w:r>
           <w:r>
             <w:fldChar w:fldCharType="end"/>
@@ -2095,7 +2094,7 @@
             <w:fldChar w:fldCharType="begin"/>
           </w:r>
           <w:r>
-            <w:instrText xml:space="preserve"> HYPERLINK \l _Toc28513 </w:instrText>
+            <w:instrText xml:space="preserve"> HYPERLINK \l _Toc17975 </w:instrText>
           </w:r>
           <w:r>
             <w:fldChar w:fldCharType="separate"/>
@@ -2113,13 +2112,13 @@
             <w:fldChar w:fldCharType="begin"/>
           </w:r>
           <w:r>
-            <w:instrText xml:space="preserve"> PAGEREF _Toc28513 \h </w:instrText>
+            <w:instrText xml:space="preserve"> PAGEREF _Toc17975 \h </w:instrText>
           </w:r>
           <w:r>
             <w:fldChar w:fldCharType="separate"/>
           </w:r>
           <w:r>
-            <w:t>21</w:t>
+            <w:t>22</w:t>
           </w:r>
           <w:r>
             <w:fldChar w:fldCharType="end"/>
@@ -2140,7 +2139,7 @@
             <w:fldChar w:fldCharType="begin"/>
           </w:r>
           <w:r>
-            <w:instrText xml:space="preserve"> HYPERLINK \l _Toc5756 </w:instrText>
+            <w:instrText xml:space="preserve"> HYPERLINK \l _Toc28139 </w:instrText>
           </w:r>
           <w:r>
             <w:fldChar w:fldCharType="separate"/>
@@ -2158,13 +2157,13 @@
             <w:fldChar w:fldCharType="begin"/>
           </w:r>
           <w:r>
-            <w:instrText xml:space="preserve"> PAGEREF _Toc5756 \h </w:instrText>
+            <w:instrText xml:space="preserve"> PAGEREF _Toc28139 \h </w:instrText>
           </w:r>
           <w:r>
             <w:fldChar w:fldCharType="separate"/>
           </w:r>
           <w:r>
-            <w:t>21</w:t>
+            <w:t>22</w:t>
           </w:r>
           <w:r>
             <w:fldChar w:fldCharType="end"/>
@@ -2185,7 +2184,7 @@
             <w:fldChar w:fldCharType="begin"/>
           </w:r>
           <w:r>
-            <w:instrText xml:space="preserve"> HYPERLINK \l _Toc18278 </w:instrText>
+            <w:instrText xml:space="preserve"> HYPERLINK \l _Toc29333 </w:instrText>
           </w:r>
           <w:r>
             <w:fldChar w:fldCharType="separate"/>
@@ -2203,13 +2202,13 @@
             <w:fldChar w:fldCharType="begin"/>
           </w:r>
           <w:r>
-            <w:instrText xml:space="preserve"> PAGEREF _Toc18278 \h </w:instrText>
+            <w:instrText xml:space="preserve"> PAGEREF _Toc29333 \h </w:instrText>
           </w:r>
           <w:r>
             <w:fldChar w:fldCharType="separate"/>
           </w:r>
           <w:r>
-            <w:t>22</w:t>
+            <w:t>23</w:t>
           </w:r>
           <w:r>
             <w:fldChar w:fldCharType="end"/>
@@ -2230,7 +2229,7 @@
             <w:fldChar w:fldCharType="begin"/>
           </w:r>
           <w:r>
-            <w:instrText xml:space="preserve"> HYPERLINK \l _Toc1385 </w:instrText>
+            <w:instrText xml:space="preserve"> HYPERLINK \l _Toc24436 </w:instrText>
           </w:r>
           <w:r>
             <w:fldChar w:fldCharType="separate"/>
@@ -2248,13 +2247,13 @@
             <w:fldChar w:fldCharType="begin"/>
           </w:r>
           <w:r>
-            <w:instrText xml:space="preserve"> PAGEREF _Toc1385 \h </w:instrText>
+            <w:instrText xml:space="preserve"> PAGEREF _Toc24436 \h </w:instrText>
           </w:r>
           <w:r>
             <w:fldChar w:fldCharType="separate"/>
           </w:r>
           <w:r>
-            <w:t>24</w:t>
+            <w:t>25</w:t>
           </w:r>
           <w:r>
             <w:fldChar w:fldCharType="end"/>
@@ -2275,7 +2274,7 @@
             <w:fldChar w:fldCharType="begin"/>
           </w:r>
           <w:r>
-            <w:instrText xml:space="preserve"> HYPERLINK \l _Toc20170 </w:instrText>
+            <w:instrText xml:space="preserve"> HYPERLINK \l _Toc7596 </w:instrText>
           </w:r>
           <w:r>
             <w:fldChar w:fldCharType="separate"/>
@@ -2293,13 +2292,13 @@
             <w:fldChar w:fldCharType="begin"/>
           </w:r>
           <w:r>
-            <w:instrText xml:space="preserve"> PAGEREF _Toc20170 \h </w:instrText>
+            <w:instrText xml:space="preserve"> PAGEREF _Toc7596 \h </w:instrText>
           </w:r>
           <w:r>
             <w:fldChar w:fldCharType="separate"/>
           </w:r>
           <w:r>
-            <w:t>25</w:t>
+            <w:t>26</w:t>
           </w:r>
           <w:r>
             <w:fldChar w:fldCharType="end"/>
@@ -2316,7 +2315,7 @@
             <w:fldChar w:fldCharType="begin"/>
           </w:r>
           <w:r>
-            <w:instrText xml:space="preserve"> HYPERLINK \l _Toc18264 </w:instrText>
+            <w:instrText xml:space="preserve"> HYPERLINK \l _Toc13369 </w:instrText>
           </w:r>
           <w:r>
             <w:fldChar w:fldCharType="separate"/>
@@ -2334,13 +2333,13 @@
             <w:fldChar w:fldCharType="begin"/>
           </w:r>
           <w:r>
-            <w:instrText xml:space="preserve"> PAGEREF _Toc18264 \h </w:instrText>
+            <w:instrText xml:space="preserve"> PAGEREF _Toc13369 \h </w:instrText>
           </w:r>
           <w:r>
             <w:fldChar w:fldCharType="separate"/>
           </w:r>
           <w:r>
-            <w:t>26</w:t>
+            <w:t>27</w:t>
           </w:r>
           <w:r>
             <w:fldChar w:fldCharType="end"/>
@@ -2361,7 +2360,7 @@
             <w:fldChar w:fldCharType="begin"/>
           </w:r>
           <w:r>
-            <w:instrText xml:space="preserve"> HYPERLINK \l _Toc721 </w:instrText>
+            <w:instrText xml:space="preserve"> HYPERLINK \l _Toc7655 </w:instrText>
           </w:r>
           <w:r>
             <w:fldChar w:fldCharType="separate"/>
@@ -2379,13 +2378,13 @@
             <w:fldChar w:fldCharType="begin"/>
           </w:r>
           <w:r>
-            <w:instrText xml:space="preserve"> PAGEREF _Toc721 \h </w:instrText>
+            <w:instrText xml:space="preserve"> PAGEREF _Toc7655 \h </w:instrText>
           </w:r>
           <w:r>
             <w:fldChar w:fldCharType="separate"/>
           </w:r>
           <w:r>
-            <w:t>26</w:t>
+            <w:t>27</w:t>
           </w:r>
           <w:r>
             <w:fldChar w:fldCharType="end"/>
@@ -2406,7 +2405,7 @@
             <w:fldChar w:fldCharType="begin"/>
           </w:r>
           <w:r>
-            <w:instrText xml:space="preserve"> HYPERLINK \l _Toc14188 </w:instrText>
+            <w:instrText xml:space="preserve"> HYPERLINK \l _Toc13838 </w:instrText>
           </w:r>
           <w:r>
             <w:fldChar w:fldCharType="separate"/>
@@ -2424,13 +2423,13 @@
             <w:fldChar w:fldCharType="begin"/>
           </w:r>
           <w:r>
-            <w:instrText xml:space="preserve"> PAGEREF _Toc14188 \h </w:instrText>
+            <w:instrText xml:space="preserve"> PAGEREF _Toc13838 \h </w:instrText>
           </w:r>
           <w:r>
             <w:fldChar w:fldCharType="separate"/>
           </w:r>
           <w:r>
-            <w:t>26</w:t>
+            <w:t>27</w:t>
           </w:r>
           <w:r>
             <w:fldChar w:fldCharType="end"/>
@@ -2447,7 +2446,7 @@
             <w:fldChar w:fldCharType="begin"/>
           </w:r>
           <w:r>
-            <w:instrText xml:space="preserve"> HYPERLINK \l _Toc8500 </w:instrText>
+            <w:instrText xml:space="preserve"> HYPERLINK \l _Toc5754 </w:instrText>
           </w:r>
           <w:r>
             <w:fldChar w:fldCharType="separate"/>
@@ -2465,13 +2464,13 @@
             <w:fldChar w:fldCharType="begin"/>
           </w:r>
           <w:r>
-            <w:instrText xml:space="preserve"> PAGEREF _Toc8500 \h </w:instrText>
+            <w:instrText xml:space="preserve"> PAGEREF _Toc5754 \h </w:instrText>
           </w:r>
           <w:r>
             <w:fldChar w:fldCharType="separate"/>
           </w:r>
           <w:r>
-            <w:t>28</w:t>
+            <w:t>29</w:t>
           </w:r>
           <w:r>
             <w:fldChar w:fldCharType="end"/>
@@ -2488,7 +2487,7 @@
             <w:fldChar w:fldCharType="begin"/>
           </w:r>
           <w:r>
-            <w:instrText xml:space="preserve"> HYPERLINK \l _Toc22271 </w:instrText>
+            <w:instrText xml:space="preserve"> HYPERLINK \l _Toc16703 </w:instrText>
           </w:r>
           <w:r>
             <w:fldChar w:fldCharType="separate"/>
@@ -2506,13 +2505,13 @@
             <w:fldChar w:fldCharType="begin"/>
           </w:r>
           <w:r>
-            <w:instrText xml:space="preserve"> PAGEREF _Toc22271 \h </w:instrText>
+            <w:instrText xml:space="preserve"> PAGEREF _Toc16703 \h </w:instrText>
           </w:r>
           <w:r>
             <w:fldChar w:fldCharType="separate"/>
           </w:r>
           <w:r>
-            <w:t>29</w:t>
+            <w:t>30</w:t>
           </w:r>
           <w:r>
             <w:fldChar w:fldCharType="end"/>
@@ -2529,7 +2528,7 @@
             <w:fldChar w:fldCharType="begin"/>
           </w:r>
           <w:r>
-            <w:instrText xml:space="preserve"> HYPERLINK \l _Toc32358 </w:instrText>
+            <w:instrText xml:space="preserve"> HYPERLINK \l _Toc18627 </w:instrText>
           </w:r>
           <w:r>
             <w:fldChar w:fldCharType="separate"/>
@@ -2547,13 +2546,13 @@
             <w:fldChar w:fldCharType="begin"/>
           </w:r>
           <w:r>
-            <w:instrText xml:space="preserve"> PAGEREF _Toc32358 \h </w:instrText>
+            <w:instrText xml:space="preserve"> PAGEREF _Toc18627 \h </w:instrText>
           </w:r>
           <w:r>
             <w:fldChar w:fldCharType="separate"/>
           </w:r>
           <w:r>
-            <w:t>30</w:t>
+            <w:t>31</w:t>
           </w:r>
           <w:r>
             <w:fldChar w:fldCharType="end"/>
@@ -2570,7 +2569,7 @@
             <w:fldChar w:fldCharType="begin"/>
           </w:r>
           <w:r>
-            <w:instrText xml:space="preserve"> HYPERLINK \l _Toc1867 </w:instrText>
+            <w:instrText xml:space="preserve"> HYPERLINK \l _Toc5874 </w:instrText>
           </w:r>
           <w:r>
             <w:fldChar w:fldCharType="separate"/>
@@ -2588,7 +2587,7 @@
             <w:fldChar w:fldCharType="begin"/>
           </w:r>
           <w:r>
-            <w:instrText xml:space="preserve"> PAGEREF _Toc1867 \h </w:instrText>
+            <w:instrText xml:space="preserve"> PAGEREF _Toc5874 \h </w:instrText>
           </w:r>
           <w:r>
             <w:fldChar w:fldCharType="separate"/>
@@ -2615,7 +2614,7 @@
             <w:fldChar w:fldCharType="begin"/>
           </w:r>
           <w:r>
-            <w:instrText xml:space="preserve"> HYPERLINK \l _Toc8960 </w:instrText>
+            <w:instrText xml:space="preserve"> HYPERLINK \l _Toc18849 </w:instrText>
           </w:r>
           <w:r>
             <w:fldChar w:fldCharType="separate"/>
@@ -2633,7 +2632,7 @@
             <w:fldChar w:fldCharType="begin"/>
           </w:r>
           <w:r>
-            <w:instrText xml:space="preserve"> PAGEREF _Toc8960 \h </w:instrText>
+            <w:instrText xml:space="preserve"> PAGEREF _Toc18849 \h </w:instrText>
           </w:r>
           <w:r>
             <w:fldChar w:fldCharType="separate"/>
@@ -2660,7 +2659,7 @@
             <w:fldChar w:fldCharType="begin"/>
           </w:r>
           <w:r>
-            <w:instrText xml:space="preserve"> HYPERLINK \l _Toc20898 </w:instrText>
+            <w:instrText xml:space="preserve"> HYPERLINK \l _Toc14225 </w:instrText>
           </w:r>
           <w:r>
             <w:fldChar w:fldCharType="separate"/>
@@ -2678,7 +2677,7 @@
             <w:fldChar w:fldCharType="begin"/>
           </w:r>
           <w:r>
-            <w:instrText xml:space="preserve"> PAGEREF _Toc20898 \h </w:instrText>
+            <w:instrText xml:space="preserve"> PAGEREF _Toc14225 \h </w:instrText>
           </w:r>
           <w:r>
             <w:fldChar w:fldCharType="separate"/>
@@ -2705,7 +2704,7 @@
             <w:fldChar w:fldCharType="begin"/>
           </w:r>
           <w:r>
-            <w:instrText xml:space="preserve"> HYPERLINK \l _Toc4517 </w:instrText>
+            <w:instrText xml:space="preserve"> HYPERLINK \l _Toc698 </w:instrText>
           </w:r>
           <w:r>
             <w:fldChar w:fldCharType="separate"/>
@@ -2723,7 +2722,7 @@
             <w:fldChar w:fldCharType="begin"/>
           </w:r>
           <w:r>
-            <w:instrText xml:space="preserve"> PAGEREF _Toc4517 \h </w:instrText>
+            <w:instrText xml:space="preserve"> PAGEREF _Toc698 \h </w:instrText>
           </w:r>
           <w:r>
             <w:fldChar w:fldCharType="separate"/>
@@ -2746,7 +2745,7 @@
             <w:fldChar w:fldCharType="begin"/>
           </w:r>
           <w:r>
-            <w:instrText xml:space="preserve"> HYPERLINK \l _Toc14931 </w:instrText>
+            <w:instrText xml:space="preserve"> HYPERLINK \l _Toc11651 </w:instrText>
           </w:r>
           <w:r>
             <w:fldChar w:fldCharType="separate"/>
@@ -2764,7 +2763,7 @@
             <w:fldChar w:fldCharType="begin"/>
           </w:r>
           <w:r>
-            <w:instrText xml:space="preserve"> PAGEREF _Toc14931 \h </w:instrText>
+            <w:instrText xml:space="preserve"> PAGEREF _Toc11651 \h </w:instrText>
           </w:r>
           <w:r>
             <w:fldChar w:fldCharType="separate"/>
@@ -2791,7 +2790,7 @@
             <w:fldChar w:fldCharType="begin"/>
           </w:r>
           <w:r>
-            <w:instrText xml:space="preserve"> HYPERLINK \l _Toc24789 </w:instrText>
+            <w:instrText xml:space="preserve"> HYPERLINK \l _Toc26313 </w:instrText>
           </w:r>
           <w:r>
             <w:fldChar w:fldCharType="separate"/>
@@ -2809,7 +2808,7 @@
             <w:fldChar w:fldCharType="begin"/>
           </w:r>
           <w:r>
-            <w:instrText xml:space="preserve"> PAGEREF _Toc24789 \h </w:instrText>
+            <w:instrText xml:space="preserve"> PAGEREF _Toc26313 \h </w:instrText>
           </w:r>
           <w:r>
             <w:fldChar w:fldCharType="separate"/>
@@ -2836,7 +2835,7 @@
             <w:fldChar w:fldCharType="begin"/>
           </w:r>
           <w:r>
-            <w:instrText xml:space="preserve"> HYPERLINK \l _Toc15262 </w:instrText>
+            <w:instrText xml:space="preserve"> HYPERLINK \l _Toc12996 </w:instrText>
           </w:r>
           <w:r>
             <w:fldChar w:fldCharType="separate"/>
@@ -2854,7 +2853,7 @@
             <w:fldChar w:fldCharType="begin"/>
           </w:r>
           <w:r>
-            <w:instrText xml:space="preserve"> PAGEREF _Toc15262 \h </w:instrText>
+            <w:instrText xml:space="preserve"> PAGEREF _Toc12996 \h </w:instrText>
           </w:r>
           <w:r>
             <w:fldChar w:fldCharType="separate"/>
@@ -2929,7 +2928,7 @@
         <w:ind w:firstLine="0"/>
         <w:jc w:val="center"/>
       </w:pPr>
-      <w:bookmarkStart w:id="1" w:name="_Toc16956"/>
+      <w:bookmarkStart w:id="1" w:name="_Toc12533"/>
       <w:r>
         <w:rPr>
           <w:rFonts w:ascii="Times New Roman" w:hAnsi="Times New Roman" w:eastAsia="黑体" w:cs="黑体"/>
@@ -3046,7 +3045,7 @@
         <w:ind w:firstLine="0"/>
         <w:jc w:val="center"/>
       </w:pPr>
-      <w:bookmarkStart w:id="2" w:name="_Toc18011"/>
+      <w:bookmarkStart w:id="2" w:name="_Toc14575"/>
       <w:r>
         <w:rPr>
           <w:rFonts w:ascii="Times New Roman" w:hAnsi="Times New Roman" w:eastAsia="Times New Roman" w:cs="Times New Roman"/>
@@ -3153,7 +3152,7 @@
         <w:ind w:firstLine="0"/>
         <w:jc w:val="center"/>
       </w:pPr>
-      <w:bookmarkStart w:id="3" w:name="_Toc3625"/>
+      <w:bookmarkStart w:id="3" w:name="_Toc1850"/>
       <w:r>
         <w:rPr>
           <w:rFonts w:ascii="Times New Roman" w:hAnsi="Times New Roman" w:eastAsia="黑体" w:cs="黑体"/>
@@ -3172,7 +3171,7 @@
         <w:ind w:firstLine="480"/>
         <w:jc w:val="left"/>
       </w:pPr>
-      <w:bookmarkStart w:id="4" w:name="_Toc32497"/>
+      <w:bookmarkStart w:id="4" w:name="_Toc14878"/>
       <w:r>
         <w:rPr>
           <w:rFonts w:ascii="Times New Roman" w:hAnsi="Times New Roman" w:eastAsia="黑体" w:cs="黑体"/>
@@ -3255,7 +3254,7 @@
         <w:ind w:firstLine="480"/>
         <w:jc w:val="left"/>
       </w:pPr>
-      <w:bookmarkStart w:id="5" w:name="_Toc17902"/>
+      <w:bookmarkStart w:id="5" w:name="_Toc5848"/>
       <w:r>
         <w:rPr>
           <w:rFonts w:ascii="Times New Roman" w:hAnsi="Times New Roman" w:eastAsia="黑体" w:cs="黑体"/>
@@ -3386,7 +3385,7 @@
         <w:ind w:firstLine="480"/>
         <w:jc w:val="left"/>
       </w:pPr>
-      <w:bookmarkStart w:id="6" w:name="_Toc3880"/>
+      <w:bookmarkStart w:id="6" w:name="_Toc29804"/>
       <w:r>
         <w:rPr>
           <w:rFonts w:ascii="Times New Roman" w:hAnsi="Times New Roman" w:eastAsia="黑体" w:cs="黑体"/>
@@ -3437,7 +3436,7 @@
         <w:ind w:firstLine="480"/>
         <w:jc w:val="left"/>
       </w:pPr>
-      <w:bookmarkStart w:id="7" w:name="_Toc23126"/>
+      <w:bookmarkStart w:id="7" w:name="_Toc17559"/>
       <w:r>
         <w:rPr>
           <w:rFonts w:ascii="Times New Roman" w:hAnsi="Times New Roman" w:eastAsia="黑体" w:cs="黑体"/>
@@ -3482,7 +3481,7 @@
         <w:ind w:firstLine="0"/>
         <w:jc w:val="center"/>
       </w:pPr>
-      <w:bookmarkStart w:id="8" w:name="_Toc16363"/>
+      <w:bookmarkStart w:id="8" w:name="_Toc3282"/>
       <w:r>
         <w:rPr>
           <w:rFonts w:ascii="Times New Roman" w:hAnsi="Times New Roman" w:eastAsia="黑体" w:cs="黑体"/>
@@ -3501,7 +3500,7 @@
         <w:ind w:firstLine="480"/>
         <w:jc w:val="left"/>
       </w:pPr>
-      <w:bookmarkStart w:id="9" w:name="_Toc18113"/>
+      <w:bookmarkStart w:id="9" w:name="_Toc28570"/>
       <w:r>
         <w:rPr>
           <w:rFonts w:ascii="Times New Roman" w:hAnsi="Times New Roman" w:eastAsia="黑体" w:cs="黑体"/>
@@ -3584,7 +3583,7 @@
         <w:ind w:firstLine="480"/>
         <w:jc w:val="left"/>
       </w:pPr>
-      <w:bookmarkStart w:id="10" w:name="_Toc9393"/>
+      <w:bookmarkStart w:id="10" w:name="_Toc9163"/>
       <w:r>
         <w:rPr>
           <w:rFonts w:ascii="Times New Roman" w:hAnsi="Times New Roman" w:eastAsia="黑体" w:cs="黑体"/>
@@ -3667,7 +3666,7 @@
         <w:ind w:firstLine="480"/>
         <w:jc w:val="left"/>
       </w:pPr>
-      <w:bookmarkStart w:id="11" w:name="_Toc10232"/>
+      <w:bookmarkStart w:id="11" w:name="_Toc1223"/>
       <w:r>
         <w:rPr>
           <w:rFonts w:ascii="Times New Roman" w:hAnsi="Times New Roman" w:eastAsia="黑体" w:cs="黑体"/>
@@ -3734,7 +3733,7 @@
         <w:ind w:firstLine="480"/>
         <w:jc w:val="left"/>
       </w:pPr>
-      <w:bookmarkStart w:id="12" w:name="_Toc10633"/>
+      <w:bookmarkStart w:id="12" w:name="_Toc28567"/>
       <w:r>
         <w:rPr>
           <w:rFonts w:ascii="Times New Roman" w:hAnsi="Times New Roman" w:eastAsia="黑体" w:cs="黑体"/>
@@ -3817,7 +3816,7 @@
         <w:ind w:firstLine="480"/>
         <w:jc w:val="left"/>
       </w:pPr>
-      <w:bookmarkStart w:id="13" w:name="_Toc6807"/>
+      <w:bookmarkStart w:id="13" w:name="_Toc12941"/>
       <w:r>
         <w:rPr>
           <w:rFonts w:ascii="Times New Roman" w:hAnsi="Times New Roman" w:eastAsia="黑体" w:cs="黑体"/>
@@ -3901,7 +3900,7 @@
         <w:ind w:firstLine="0"/>
         <w:jc w:val="center"/>
       </w:pPr>
-      <w:bookmarkStart w:id="14" w:name="_Toc24158"/>
+      <w:bookmarkStart w:id="14" w:name="_Toc6505"/>
       <w:r>
         <w:rPr>
           <w:rFonts w:ascii="Times New Roman" w:hAnsi="Times New Roman" w:eastAsia="黑体" w:cs="黑体"/>
@@ -3920,7 +3919,7 @@
         <w:ind w:firstLine="480"/>
         <w:jc w:val="left"/>
       </w:pPr>
-      <w:bookmarkStart w:id="15" w:name="_Toc9643"/>
+      <w:bookmarkStart w:id="15" w:name="_Toc26570"/>
       <w:r>
         <w:rPr>
           <w:rFonts w:ascii="Times New Roman" w:hAnsi="Times New Roman" w:eastAsia="黑体" w:cs="黑体"/>
@@ -3945,7 +3944,26 @@
           <w:color w:val="000000"/>
           <w:sz w:val="24"/>
         </w:rPr>
-        <w:t>本系统面向求职训练场景，核心业务流程围绕“用户身份建立—简历处理—面试会话启动—多轮对话交互—结果评估反馈”展开。根据系统目标与功能划分，系统主要包含用户注册与登录、简历上传与智能诊断、模拟面试发起、多轮对话面试以及评估报告查看五类核心用例，核心用例关系如图 3.2 所示。</w:t>
+        <w:t>本系统面向求职训练场景，核心业务流程围绕“用户身份建立—简历处理—面试会话启动—多轮对话交互—结果评估反馈”展开。根据系统目标与功能划分，系统主要包含用户注册与登录、简历上传与智能诊断、模拟面试发起、多轮对话面试以及评估报告查看五类核心用例，核心用例关系如图 3.</w:t>
+      </w:r>
+      <w:r>
+        <w:rPr>
+          <w:rFonts w:hint="eastAsia" w:cs="宋体"/>
+          <w:b w:val="0"/>
+          <w:color w:val="000000"/>
+          <w:sz w:val="24"/>
+          <w:lang w:val="en-US" w:eastAsia="zh-CN"/>
+        </w:rPr>
+        <w:t>1</w:t>
+      </w:r>
+      <w:r>
+        <w:rPr>
+          <w:rFonts w:ascii="Times New Roman" w:hAnsi="Times New Roman" w:eastAsia="宋体" w:cs="宋体"/>
+          <w:b w:val="0"/>
+          <w:color w:val="000000"/>
+          <w:sz w:val="24"/>
+        </w:rPr>
+        <w:t xml:space="preserve"> 所示。</w:t>
       </w:r>
     </w:p>
     <w:p>
@@ -3974,8 +3992,8 @@
         <w:drawing>
           <wp:inline distT="0" distB="0" distL="0" distR="0">
             <wp:extent cx="5029200" cy="2045970"/>
-            <wp:effectExtent l="0" t="0" r="0" b="0"/>
-            <wp:docPr id="2" name="Picture 1"/>
+            <wp:effectExtent l="0" t="0" r="0" b="1905"/>
+            <wp:docPr id="2" name="Picture 1" descr="E:/graduation-project/thesis-assets/diagrams/fig-3.1-core-use-case.pngfig-3.1-core-use-case"/>
             <wp:cNvGraphicFramePr>
               <a:graphicFrameLocks xmlns:a="http://schemas.openxmlformats.org/drawingml/2006/main" noChangeAspect="1"/>
             </wp:cNvGraphicFramePr>
@@ -3983,13 +4001,14 @@
               <a:graphicData uri="http://schemas.openxmlformats.org/drawingml/2006/picture">
                 <pic:pic xmlns:pic="http://schemas.openxmlformats.org/drawingml/2006/picture">
                   <pic:nvPicPr>
-                    <pic:cNvPr id="2" name="Picture 1"/>
+                    <pic:cNvPr id="2" name="Picture 1" descr="E:/graduation-project/thesis-assets/diagrams/fig-3.1-core-use-case.pngfig-3.1-core-use-case"/>
                     <pic:cNvPicPr>
                       <a:picLocks noChangeAspect="1" noChangeArrowheads="1"/>
                     </pic:cNvPicPr>
                   </pic:nvPicPr>
                   <pic:blipFill>
                     <a:blip r:embed="rId23"/>
+                    <a:srcRect l="854" r="854"/>
                     <a:stretch>
                       <a:fillRect/>
                     </a:stretch>
@@ -4024,7 +4043,26 @@
           <w:color w:val="000000"/>
           <w:sz w:val="21"/>
         </w:rPr>
-        <w:t>图 3.2 系统核心用例图</w:t>
+        <w:t>图 3.</w:t>
+      </w:r>
+      <w:r>
+        <w:rPr>
+          <w:rFonts w:hint="eastAsia" w:eastAsia="黑体" w:cs="黑体"/>
+          <w:b/>
+          <w:color w:val="000000"/>
+          <w:sz w:val="21"/>
+          <w:lang w:val="en-US" w:eastAsia="zh-CN"/>
+        </w:rPr>
+        <w:t>1</w:t>
+      </w:r>
+      <w:r>
+        <w:rPr>
+          <w:rFonts w:ascii="Times New Roman" w:hAnsi="Times New Roman" w:eastAsia="黑体" w:cs="黑体"/>
+          <w:b/>
+          <w:color w:val="000000"/>
+          <w:sz w:val="21"/>
+        </w:rPr>
+        <w:t xml:space="preserve"> 系统核心用例图</w:t>
       </w:r>
     </w:p>
     <w:p>
@@ -4114,7 +4152,7 @@
         <w:ind w:firstLine="480"/>
         <w:jc w:val="left"/>
       </w:pPr>
-      <w:bookmarkStart w:id="16" w:name="_Toc20875"/>
+      <w:bookmarkStart w:id="16" w:name="_Toc32060"/>
       <w:r>
         <w:rPr>
           <w:rFonts w:ascii="Times New Roman" w:hAnsi="Times New Roman" w:eastAsia="黑体" w:cs="黑体"/>
@@ -4181,7 +4219,7 @@
         <w:ind w:firstLine="480"/>
         <w:jc w:val="left"/>
       </w:pPr>
-      <w:bookmarkStart w:id="17" w:name="_Toc23428"/>
+      <w:bookmarkStart w:id="17" w:name="_Toc24277"/>
       <w:r>
         <w:rPr>
           <w:rFonts w:ascii="Times New Roman" w:hAnsi="Times New Roman" w:eastAsia="黑体" w:cs="黑体"/>
@@ -4206,7 +4244,26 @@
           <w:color w:val="000000"/>
           <w:sz w:val="24"/>
         </w:rPr>
-        <w:t>本系统数据库围绕用户、简历、岗位模板、面试会话与对话消息五类核心对象进行设计，并补充阶段、评分历史、薄弱点和模型 Provider 配置等支撑对象，以满足用户身份管理、数据复用、上下文组织与结果追踪等需求。数据库主要实体关系如图 3.3 所示。user 表用于存储系统用户的基础信息，是所有业务数据的归属主体；resume 表用于保存用户上传的简历文件名称、原始文本以及结构化提取结果，并通过 user_id 与用户形成一对多关系，支持同一用户管理多份简历。</w:t>
+        <w:t>本系统数据库围绕用户、简历、岗位模板、面试会话与对话消息五类核心对象进行设计，并补充阶段、评分历史、薄弱点和模型 Provider 配置等支撑对象，以满足用户身份管理、数据复用、上下文组织与结果追踪等需求。数据库主要实体关系如图 3.</w:t>
+      </w:r>
+      <w:r>
+        <w:rPr>
+          <w:rFonts w:hint="eastAsia" w:cs="宋体"/>
+          <w:b w:val="0"/>
+          <w:color w:val="000000"/>
+          <w:sz w:val="24"/>
+          <w:lang w:val="en-US" w:eastAsia="zh-CN"/>
+        </w:rPr>
+        <w:t>2</w:t>
+      </w:r>
+      <w:r>
+        <w:rPr>
+          <w:rFonts w:ascii="Times New Roman" w:hAnsi="Times New Roman" w:eastAsia="宋体" w:cs="宋体"/>
+          <w:b w:val="0"/>
+          <w:color w:val="000000"/>
+          <w:sz w:val="24"/>
+        </w:rPr>
+        <w:t xml:space="preserve"> 所示。user 表用于存储系统用户的基础信息，是所有业务数据的归属主体；resume 表用于保存用户上传的简历文件名称、原始文本以及结构化提取结果，并通过 user_id 与用户形成一对多关系，支持同一用户管理多份简历。</w:t>
       </w:r>
     </w:p>
     <w:p>
@@ -4214,13 +4271,21 @@
         <w:spacing w:before="0" w:after="0" w:line="360" w:lineRule="auto"/>
         <w:ind w:firstLine="0"/>
         <w:jc w:val="center"/>
-      </w:pPr>
-      <w:r>
+        <w:rPr>
+          <w:rFonts w:hint="eastAsia" w:eastAsia="宋体"/>
+          <w:lang w:eastAsia="zh-CN"/>
+        </w:rPr>
+      </w:pPr>
+      <w:r>
+        <w:rPr>
+          <w:rFonts w:hint="eastAsia" w:eastAsia="宋体"/>
+          <w:lang w:eastAsia="zh-CN"/>
+        </w:rPr>
         <w:drawing>
-          <wp:inline distT="0" distB="0" distL="0" distR="0">
-            <wp:extent cx="5029200" cy="5407660"/>
-            <wp:effectExtent l="0" t="0" r="0" b="0"/>
-            <wp:docPr id="3" name="Picture 2"/>
+          <wp:inline distT="0" distB="0" distL="114300" distR="114300">
+            <wp:extent cx="5753735" cy="6577965"/>
+            <wp:effectExtent l="0" t="0" r="8890" b="3810"/>
+            <wp:docPr id="1" name="图片 1" descr="fig-3.2-database-er"/>
             <wp:cNvGraphicFramePr>
               <a:graphicFrameLocks xmlns:a="http://schemas.openxmlformats.org/drawingml/2006/main" noChangeAspect="1"/>
             </wp:cNvGraphicFramePr>
@@ -4228,9 +4293,9 @@
               <a:graphicData uri="http://schemas.openxmlformats.org/drawingml/2006/picture">
                 <pic:pic xmlns:pic="http://schemas.openxmlformats.org/drawingml/2006/picture">
                   <pic:nvPicPr>
-                    <pic:cNvPr id="3" name="Picture 2"/>
+                    <pic:cNvPr id="1" name="图片 1" descr="fig-3.2-database-er"/>
                     <pic:cNvPicPr>
-                      <a:picLocks noChangeAspect="1" noChangeArrowheads="1"/>
+                      <a:picLocks noChangeAspect="1"/>
                     </pic:cNvPicPr>
                   </pic:nvPicPr>
                   <pic:blipFill>
@@ -4242,12 +4307,11 @@
                   <pic:spPr>
                     <a:xfrm>
                       <a:off x="0" y="0"/>
-                      <a:ext cx="5029200" cy="5407660"/>
+                      <a:ext cx="5753735" cy="6577965"/>
                     </a:xfrm>
                     <a:prstGeom prst="rect">
                       <a:avLst/>
                     </a:prstGeom>
-                    <a:noFill/>
                   </pic:spPr>
                 </pic:pic>
               </a:graphicData>
@@ -4269,7 +4333,26 @@
           <w:color w:val="000000"/>
           <w:sz w:val="21"/>
         </w:rPr>
-        <w:t>图 3.3 数据库 E-R 图</w:t>
+        <w:t>图 3.</w:t>
+      </w:r>
+      <w:r>
+        <w:rPr>
+          <w:rFonts w:hint="eastAsia" w:eastAsia="黑体" w:cs="黑体"/>
+          <w:b/>
+          <w:color w:val="000000"/>
+          <w:sz w:val="21"/>
+          <w:lang w:val="en-US" w:eastAsia="zh-CN"/>
+        </w:rPr>
+        <w:t>2</w:t>
+      </w:r>
+      <w:r>
+        <w:rPr>
+          <w:rFonts w:ascii="Times New Roman" w:hAnsi="Times New Roman" w:eastAsia="黑体" w:cs="黑体"/>
+          <w:b/>
+          <w:color w:val="000000"/>
+          <w:sz w:val="21"/>
+        </w:rPr>
+        <w:t xml:space="preserve"> 数据库 E-R 图</w:t>
       </w:r>
     </w:p>
     <w:p>
@@ -4311,7 +4394,7 @@
         <w:ind w:firstLine="480"/>
         <w:jc w:val="left"/>
       </w:pPr>
-      <w:bookmarkStart w:id="18" w:name="_Toc7168"/>
+      <w:bookmarkStart w:id="18" w:name="_Toc10536"/>
       <w:r>
         <w:rPr>
           <w:rFonts w:ascii="Times New Roman" w:hAnsi="Times New Roman" w:eastAsia="黑体" w:cs="黑体"/>
@@ -4336,7 +4419,26 @@
           <w:color w:val="000000"/>
           <w:sz w:val="24"/>
         </w:rPr>
-        <w:t>从总体架构看，本系统由浏览器客户端、Spring Boot 服务层、MySQL 数据库和 DeepSeek/OpenAI 兼容模型服务四个层次组成，整体架构如图 3.1 所示。浏览器客户端负责用户界面展示、简历上传、面试问答交互与报告查看；Spring Boot 服务层负责业务编排、权限校验、文件处理、数据库读写和模型调用；MySQL 数据库负责存储用户、简历、会话与消息等核心业务数据；外部大语言模型服务承担结构化提取、动态问答生成和评估报告输出等任务。</w:t>
+        <w:t>从总体架构看，本系统由浏览器客户端、Spring Boot 服务层、MySQL 数据库和 DeepSeek/OpenAI 兼容模型服务四个层次组成，整体架构如图 3.</w:t>
+      </w:r>
+      <w:r>
+        <w:rPr>
+          <w:rFonts w:hint="eastAsia" w:cs="宋体"/>
+          <w:b w:val="0"/>
+          <w:color w:val="000000"/>
+          <w:sz w:val="24"/>
+          <w:lang w:val="en-US" w:eastAsia="zh-CN"/>
+        </w:rPr>
+        <w:t>3</w:t>
+      </w:r>
+      <w:r>
+        <w:rPr>
+          <w:rFonts w:ascii="Times New Roman" w:hAnsi="Times New Roman" w:eastAsia="宋体" w:cs="宋体"/>
+          <w:b w:val="0"/>
+          <w:color w:val="000000"/>
+          <w:sz w:val="24"/>
+        </w:rPr>
+        <w:t xml:space="preserve"> 所示。浏览器客户端负责用户界面展示、简历上传、面试问答交互与报告查看；Spring Boot 服务层负责业务编排、权限校验、文件处理、数据库读写和模型调用；MySQL 数据库负责存储用户、简历、会话与消息等核心业务数据；外部大语言模型服务承担结构化提取、动态问答生成和评估报告输出等任务。</w:t>
       </w:r>
     </w:p>
     <w:p>
@@ -4344,13 +4446,21 @@
         <w:spacing w:before="0" w:after="0" w:line="360" w:lineRule="auto"/>
         <w:ind w:firstLine="0"/>
         <w:jc w:val="center"/>
-      </w:pPr>
-      <w:r>
+        <w:rPr>
+          <w:rFonts w:hint="eastAsia" w:eastAsia="宋体"/>
+          <w:lang w:eastAsia="zh-CN"/>
+        </w:rPr>
+      </w:pPr>
+      <w:r>
+        <w:rPr>
+          <w:rFonts w:hint="eastAsia" w:eastAsia="宋体"/>
+          <w:lang w:eastAsia="zh-CN"/>
+        </w:rPr>
         <w:drawing>
-          <wp:inline distT="0" distB="0" distL="0" distR="0">
-            <wp:extent cx="5029200" cy="1410970"/>
-            <wp:effectExtent l="0" t="0" r="0" b="0"/>
-            <wp:docPr id="4" name="Picture 3"/>
+          <wp:inline distT="0" distB="0" distL="114300" distR="114300">
+            <wp:extent cx="5755005" cy="2057400"/>
+            <wp:effectExtent l="0" t="0" r="7620" b="0"/>
+            <wp:docPr id="3" name="图片 3" descr="fig-3.3-system-architecture"/>
             <wp:cNvGraphicFramePr>
               <a:graphicFrameLocks xmlns:a="http://schemas.openxmlformats.org/drawingml/2006/main" noChangeAspect="1"/>
             </wp:cNvGraphicFramePr>
@@ -4358,9 +4468,9 @@
               <a:graphicData uri="http://schemas.openxmlformats.org/drawingml/2006/picture">
                 <pic:pic xmlns:pic="http://schemas.openxmlformats.org/drawingml/2006/picture">
                   <pic:nvPicPr>
-                    <pic:cNvPr id="4" name="Picture 3"/>
+                    <pic:cNvPr id="3" name="图片 3" descr="fig-3.3-system-architecture"/>
                     <pic:cNvPicPr>
-                      <a:picLocks noChangeAspect="1" noChangeArrowheads="1"/>
+                      <a:picLocks noChangeAspect="1"/>
                     </pic:cNvPicPr>
                   </pic:nvPicPr>
                   <pic:blipFill>
@@ -4372,12 +4482,11 @@
                   <pic:spPr>
                     <a:xfrm>
                       <a:off x="0" y="0"/>
-                      <a:ext cx="5029200" cy="1410970"/>
+                      <a:ext cx="5755005" cy="2057400"/>
                     </a:xfrm>
                     <a:prstGeom prst="rect">
                       <a:avLst/>
                     </a:prstGeom>
-                    <a:noFill/>
                   </pic:spPr>
                 </pic:pic>
               </a:graphicData>
@@ -4399,7 +4508,26 @@
           <w:color w:val="000000"/>
           <w:sz w:val="21"/>
         </w:rPr>
-        <w:t>图 3.1 系统整体架构图</w:t>
+        <w:t>图 3.</w:t>
+      </w:r>
+      <w:r>
+        <w:rPr>
+          <w:rFonts w:hint="eastAsia" w:eastAsia="黑体" w:cs="黑体"/>
+          <w:b/>
+          <w:color w:val="000000"/>
+          <w:sz w:val="21"/>
+          <w:lang w:val="en-US" w:eastAsia="zh-CN"/>
+        </w:rPr>
+        <w:t>3</w:t>
+      </w:r>
+      <w:r>
+        <w:rPr>
+          <w:rFonts w:ascii="Times New Roman" w:hAnsi="Times New Roman" w:eastAsia="黑体" w:cs="黑体"/>
+          <w:b/>
+          <w:color w:val="000000"/>
+          <w:sz w:val="21"/>
+        </w:rPr>
+        <w:t xml:space="preserve"> 系统整体架构图</w:t>
       </w:r>
     </w:p>
     <w:p>
@@ -4435,7 +4563,7 @@
         <w:ind w:firstLine="0"/>
         <w:jc w:val="center"/>
       </w:pPr>
-      <w:bookmarkStart w:id="19" w:name="_Toc27077"/>
+      <w:bookmarkStart w:id="19" w:name="_Toc15876"/>
       <w:r>
         <w:rPr>
           <w:rFonts w:ascii="Times New Roman" w:hAnsi="Times New Roman" w:eastAsia="黑体" w:cs="黑体"/>
@@ -4454,7 +4582,7 @@
         <w:ind w:firstLine="480"/>
         <w:jc w:val="left"/>
       </w:pPr>
-      <w:bookmarkStart w:id="20" w:name="_Toc4988"/>
+      <w:bookmarkStart w:id="20" w:name="_Toc8291"/>
       <w:r>
         <w:rPr>
           <w:rFonts w:ascii="Times New Roman" w:hAnsi="Times New Roman" w:eastAsia="黑体" w:cs="黑体"/>
@@ -4521,7 +4649,7 @@
         <w:ind w:firstLine="480"/>
         <w:jc w:val="left"/>
       </w:pPr>
-      <w:bookmarkStart w:id="21" w:name="_Toc23347"/>
+      <w:bookmarkStart w:id="21" w:name="_Toc24861"/>
       <w:r>
         <w:rPr>
           <w:rFonts w:ascii="Times New Roman" w:hAnsi="Times New Roman" w:eastAsia="黑体" w:cs="黑体"/>
@@ -4588,7 +4716,7 @@
         <w:ind w:firstLine="480"/>
         <w:jc w:val="left"/>
       </w:pPr>
-      <w:bookmarkStart w:id="22" w:name="_Toc31659"/>
+      <w:bookmarkStart w:id="22" w:name="_Toc18266"/>
       <w:r>
         <w:rPr>
           <w:rFonts w:ascii="Times New Roman" w:hAnsi="Times New Roman" w:eastAsia="黑体" w:cs="黑体"/>
@@ -4687,7 +4815,7 @@
         <w:ind w:firstLine="480"/>
         <w:jc w:val="left"/>
       </w:pPr>
-      <w:bookmarkStart w:id="23" w:name="_Toc8412"/>
+      <w:bookmarkStart w:id="23" w:name="_Toc15251"/>
       <w:r>
         <w:rPr>
           <w:rFonts w:ascii="Times New Roman" w:hAnsi="Times New Roman" w:eastAsia="黑体" w:cs="黑体"/>
@@ -4754,7 +4882,7 @@
         <w:ind w:firstLine="480"/>
         <w:jc w:val="left"/>
       </w:pPr>
-      <w:bookmarkStart w:id="24" w:name="_Toc5420"/>
+      <w:bookmarkStart w:id="24" w:name="_Toc18822"/>
       <w:r>
         <w:rPr>
           <w:rFonts w:ascii="Times New Roman" w:hAnsi="Times New Roman" w:eastAsia="黑体" w:cs="黑体"/>
@@ -4853,7 +4981,7 @@
         <w:ind w:firstLine="480"/>
         <w:jc w:val="left"/>
       </w:pPr>
-      <w:bookmarkStart w:id="25" w:name="_Toc25989"/>
+      <w:bookmarkStart w:id="25" w:name="_Toc393"/>
       <w:r>
         <w:rPr>
           <w:rFonts w:ascii="Times New Roman" w:hAnsi="Times New Roman" w:eastAsia="黑体" w:cs="黑体"/>
@@ -4920,7 +5048,7 @@
         <w:ind w:firstLine="480"/>
         <w:jc w:val="left"/>
       </w:pPr>
-      <w:bookmarkStart w:id="26" w:name="_Toc8648"/>
+      <w:bookmarkStart w:id="26" w:name="_Toc3810"/>
       <w:r>
         <w:rPr>
           <w:rFonts w:ascii="Times New Roman" w:hAnsi="Times New Roman" w:eastAsia="黑体" w:cs="黑体"/>
@@ -4981,7 +5109,7 @@
         <w:ind w:firstLine="0"/>
         <w:jc w:val="center"/>
       </w:pPr>
-      <w:bookmarkStart w:id="27" w:name="_Toc1416"/>
+      <w:bookmarkStart w:id="27" w:name="_Toc30176"/>
       <w:r>
         <w:rPr>
           <w:rFonts w:ascii="Times New Roman" w:hAnsi="Times New Roman" w:eastAsia="黑体" w:cs="黑体"/>
@@ -5000,7 +5128,7 @@
         <w:ind w:firstLine="480"/>
         <w:jc w:val="left"/>
       </w:pPr>
-      <w:bookmarkStart w:id="28" w:name="_Toc28513"/>
+      <w:bookmarkStart w:id="28" w:name="_Toc17975"/>
       <w:r>
         <w:rPr>
           <w:rFonts w:ascii="Times New Roman" w:hAnsi="Times New Roman" w:eastAsia="黑体" w:cs="黑体"/>
@@ -5067,7 +5195,7 @@
         <w:ind w:firstLine="480"/>
         <w:jc w:val="left"/>
       </w:pPr>
-      <w:bookmarkStart w:id="29" w:name="_Toc5756"/>
+      <w:bookmarkStart w:id="29" w:name="_Toc28139"/>
       <w:r>
         <w:rPr>
           <w:rFonts w:ascii="Times New Roman" w:hAnsi="Times New Roman" w:eastAsia="黑体" w:cs="黑体"/>
@@ -5092,7 +5220,26 @@
           <w:color w:val="000000"/>
           <w:sz w:val="24"/>
         </w:rPr>
-        <w:t>本系统的测试环境以本地开发部署为主，主要由浏览器端、后端服务、数据库服务和外部模型调用环境构成。前端页面在浏览器中运行，后端基于 Spring Boot 启动服务，数据库采用 MySQL 8.0 存储业务数据，模型能力通过 DeepSeek API 获取。当前已采集的本机测试环境如表 5.2 所示。</w:t>
+        <w:t>本系统的测试环境以本地开发部署为主，主要由浏览器端、后端服务、数据库服务和外部模型调用环境构成。前端页面在浏览器中运行，后端基于 Spring Boot 启动服务，数据库采用 MySQL 8.0 存储业务数据，模型能力通过 DeepSeek API 获取。当前已采集的本机测试环境如表 5.</w:t>
+      </w:r>
+      <w:r>
+        <w:rPr>
+          <w:rFonts w:hint="eastAsia" w:cs="宋体"/>
+          <w:b w:val="0"/>
+          <w:color w:val="000000"/>
+          <w:sz w:val="24"/>
+          <w:lang w:val="en-US" w:eastAsia="zh-CN"/>
+        </w:rPr>
+        <w:t>1</w:t>
+      </w:r>
+      <w:r>
+        <w:rPr>
+          <w:rFonts w:ascii="Times New Roman" w:hAnsi="Times New Roman" w:eastAsia="宋体" w:cs="宋体"/>
+          <w:b w:val="0"/>
+          <w:color w:val="000000"/>
+          <w:sz w:val="24"/>
+        </w:rPr>
+        <w:t xml:space="preserve"> 所示。</w:t>
       </w:r>
     </w:p>
     <w:p>
@@ -5108,7 +5255,26 @@
           <w:color w:val="000000"/>
           <w:sz w:val="21"/>
         </w:rPr>
-        <w:t>表 5.2 测试环境表</w:t>
+        <w:t>表 5.</w:t>
+      </w:r>
+      <w:r>
+        <w:rPr>
+          <w:rFonts w:hint="eastAsia" w:eastAsia="黑体" w:cs="黑体"/>
+          <w:b/>
+          <w:color w:val="000000"/>
+          <w:sz w:val="21"/>
+          <w:lang w:val="en-US" w:eastAsia="zh-CN"/>
+        </w:rPr>
+        <w:t>1</w:t>
+      </w:r>
+      <w:r>
+        <w:rPr>
+          <w:rFonts w:ascii="Times New Roman" w:hAnsi="Times New Roman" w:eastAsia="黑体" w:cs="黑体"/>
+          <w:b/>
+          <w:color w:val="000000"/>
+          <w:sz w:val="21"/>
+        </w:rPr>
+        <w:t xml:space="preserve"> 测试环境表</w:t>
       </w:r>
     </w:p>
     <w:tbl>
@@ -5825,7 +5991,7 @@
         <w:ind w:firstLine="480"/>
         <w:jc w:val="left"/>
       </w:pPr>
-      <w:bookmarkStart w:id="30" w:name="_Toc18278"/>
+      <w:bookmarkStart w:id="30" w:name="_Toc29333"/>
       <w:r>
         <w:rPr>
           <w:rFonts w:ascii="Times New Roman" w:hAnsi="Times New Roman" w:eastAsia="黑体" w:cs="黑体"/>
@@ -5898,7 +6064,26 @@
           <w:color w:val="000000"/>
           <w:sz w:val="21"/>
         </w:rPr>
-        <w:t>表 5.1 功能测试用例表</w:t>
+        <w:t>表 5.</w:t>
+      </w:r>
+      <w:r>
+        <w:rPr>
+          <w:rFonts w:hint="eastAsia" w:eastAsia="黑体" w:cs="黑体"/>
+          <w:b/>
+          <w:color w:val="000000"/>
+          <w:sz w:val="21"/>
+          <w:lang w:val="en-US" w:eastAsia="zh-CN"/>
+        </w:rPr>
+        <w:t>2</w:t>
+      </w:r>
+      <w:r>
+        <w:rPr>
+          <w:rFonts w:ascii="Times New Roman" w:hAnsi="Times New Roman" w:eastAsia="黑体" w:cs="黑体"/>
+          <w:b/>
+          <w:color w:val="000000"/>
+          <w:sz w:val="21"/>
+        </w:rPr>
+        <w:t xml:space="preserve"> 功能测试用例表</w:t>
       </w:r>
     </w:p>
     <w:tbl>
@@ -7927,7 +8112,7 @@
         <w:ind w:firstLine="480"/>
         <w:jc w:val="left"/>
       </w:pPr>
-      <w:bookmarkStart w:id="31" w:name="_Toc1385"/>
+      <w:bookmarkStart w:id="31" w:name="_Toc24436"/>
       <w:r>
         <w:rPr>
           <w:rFonts w:ascii="Times New Roman" w:hAnsi="Times New Roman" w:eastAsia="黑体" w:cs="黑体"/>
@@ -8483,7 +8668,7 @@
         <w:ind w:firstLine="480"/>
         <w:jc w:val="left"/>
       </w:pPr>
-      <w:bookmarkStart w:id="32" w:name="_Toc20170"/>
+      <w:bookmarkStart w:id="32" w:name="_Toc7596"/>
       <w:r>
         <w:rPr>
           <w:rFonts w:ascii="Times New Roman" w:hAnsi="Times New Roman" w:eastAsia="黑体" w:cs="黑体"/>
@@ -8560,7 +8745,7 @@
         <w:ind w:firstLine="0"/>
         <w:jc w:val="center"/>
       </w:pPr>
-      <w:bookmarkStart w:id="33" w:name="_Toc18264"/>
+      <w:bookmarkStart w:id="33" w:name="_Toc13369"/>
       <w:r>
         <w:rPr>
           <w:rFonts w:ascii="Times New Roman" w:hAnsi="Times New Roman" w:eastAsia="黑体" w:cs="黑体"/>
@@ -8579,7 +8764,7 @@
         <w:ind w:firstLine="480"/>
         <w:jc w:val="left"/>
       </w:pPr>
-      <w:bookmarkStart w:id="34" w:name="_Toc721"/>
+      <w:bookmarkStart w:id="34" w:name="_Toc7655"/>
       <w:r>
         <w:rPr>
           <w:rFonts w:ascii="Times New Roman" w:hAnsi="Times New Roman" w:eastAsia="黑体" w:cs="黑体"/>
@@ -8630,7 +8815,7 @@
         <w:ind w:firstLine="480"/>
         <w:jc w:val="left"/>
       </w:pPr>
-      <w:bookmarkStart w:id="35" w:name="_Toc14188"/>
+      <w:bookmarkStart w:id="35" w:name="_Toc13838"/>
       <w:r>
         <w:rPr>
           <w:rFonts w:ascii="Times New Roman" w:hAnsi="Times New Roman" w:eastAsia="黑体" w:cs="黑体"/>
@@ -8691,7 +8876,7 @@
         <w:ind w:firstLine="0"/>
         <w:jc w:val="center"/>
       </w:pPr>
-      <w:bookmarkStart w:id="36" w:name="_Toc8500"/>
+      <w:bookmarkStart w:id="36" w:name="_Toc5754"/>
       <w:r>
         <w:rPr>
           <w:rFonts w:ascii="Times New Roman" w:hAnsi="Times New Roman" w:eastAsia="黑体" w:cs="黑体"/>
@@ -9047,7 +9232,7 @@
         <w:ind w:firstLine="0"/>
         <w:jc w:val="center"/>
       </w:pPr>
-      <w:bookmarkStart w:id="37" w:name="_Toc22271"/>
+      <w:bookmarkStart w:id="37" w:name="_Toc16703"/>
       <w:r>
         <w:rPr>
           <w:rFonts w:ascii="Times New Roman" w:hAnsi="Times New Roman" w:eastAsia="黑体" w:cs="黑体"/>
@@ -9092,7 +9277,7 @@
         <w:ind w:firstLine="0"/>
         <w:jc w:val="center"/>
       </w:pPr>
-      <w:bookmarkStart w:id="38" w:name="_Toc32358"/>
+      <w:bookmarkStart w:id="38" w:name="_Toc18627"/>
       <w:r>
         <w:rPr>
           <w:rFonts w:ascii="Times New Roman" w:hAnsi="Times New Roman" w:eastAsia="黑体" w:cs="黑体"/>
@@ -9109,13 +9294,21 @@
         <w:spacing w:before="0" w:after="0" w:line="360" w:lineRule="auto"/>
         <w:ind w:firstLine="0"/>
         <w:jc w:val="center"/>
-      </w:pPr>
-      <w:r>
+        <w:rPr>
+          <w:rFonts w:hint="eastAsia" w:eastAsia="宋体"/>
+          <w:lang w:eastAsia="zh-CN"/>
+        </w:rPr>
+      </w:pPr>
+      <w:r>
+        <w:rPr>
+          <w:rFonts w:hint="eastAsia" w:eastAsia="宋体"/>
+          <w:lang w:eastAsia="zh-CN"/>
+        </w:rPr>
         <w:drawing>
-          <wp:inline distT="0" distB="0" distL="0" distR="0">
-            <wp:extent cx="4140200" cy="3662680"/>
-            <wp:effectExtent l="0" t="0" r="3175" b="4445"/>
-            <wp:docPr id="5" name="Picture 4" descr="E:/graduation-project/docs/images/login.pnglogin"/>
+          <wp:inline distT="0" distB="0" distL="114300" distR="114300">
+            <wp:extent cx="3924300" cy="3472180"/>
+            <wp:effectExtent l="0" t="0" r="0" b="4445"/>
+            <wp:docPr id="4" name="图片 4" descr="login"/>
             <wp:cNvGraphicFramePr>
               <a:graphicFrameLocks xmlns:a="http://schemas.openxmlformats.org/drawingml/2006/main" noChangeAspect="1"/>
             </wp:cNvGraphicFramePr>
@@ -9123,14 +9316,13 @@
               <a:graphicData uri="http://schemas.openxmlformats.org/drawingml/2006/picture">
                 <pic:pic xmlns:pic="http://schemas.openxmlformats.org/drawingml/2006/picture">
                   <pic:nvPicPr>
-                    <pic:cNvPr id="5" name="Picture 4" descr="E:/graduation-project/docs/images/login.pnglogin"/>
+                    <pic:cNvPr id="4" name="图片 4" descr="login"/>
                     <pic:cNvPicPr>
-                      <a:picLocks noChangeAspect="1" noChangeArrowheads="1"/>
+                      <a:picLocks noChangeAspect="1"/>
                     </pic:cNvPicPr>
                   </pic:nvPicPr>
                   <pic:blipFill>
                     <a:blip r:embed="rId26"/>
-                    <a:srcRect t="8" b="8"/>
                     <a:stretch>
                       <a:fillRect/>
                     </a:stretch>
@@ -9138,12 +9330,11 @@
                   <pic:spPr>
                     <a:xfrm>
                       <a:off x="0" y="0"/>
-                      <a:ext cx="4140200" cy="3662680"/>
+                      <a:ext cx="3924300" cy="3472180"/>
                     </a:xfrm>
                     <a:prstGeom prst="rect">
                       <a:avLst/>
                     </a:prstGeom>
-                    <a:noFill/>
                   </pic:spPr>
                 </pic:pic>
               </a:graphicData>
@@ -9173,19 +9364,29 @@
         </w:rPr>
         <w:t>附图 A.1 登录页面</w:t>
       </w:r>
+      <w:bookmarkStart w:id="46" w:name="_GoBack"/>
+      <w:bookmarkEnd w:id="46"/>
     </w:p>
     <w:p>
       <w:pPr>
         <w:spacing w:before="0" w:after="0" w:line="360" w:lineRule="auto"/>
         <w:ind w:firstLine="0"/>
         <w:jc w:val="center"/>
-      </w:pPr>
-      <w:r>
+        <w:rPr>
+          <w:rFonts w:hint="eastAsia" w:eastAsia="宋体"/>
+          <w:lang w:eastAsia="zh-CN"/>
+        </w:rPr>
+      </w:pPr>
+      <w:r>
+        <w:rPr>
+          <w:rFonts w:hint="eastAsia" w:eastAsia="宋体"/>
+          <w:lang w:eastAsia="zh-CN"/>
+        </w:rPr>
         <w:drawing>
-          <wp:inline distT="0" distB="0" distL="0" distR="0">
-            <wp:extent cx="4140200" cy="5635625"/>
-            <wp:effectExtent l="0" t="0" r="3175" b="3175"/>
-            <wp:docPr id="6" name="Picture 5" descr="E:/graduation-project/docs/images/interview-workbench.pnginterview-workbench"/>
+          <wp:inline distT="0" distB="0" distL="114300" distR="114300">
+            <wp:extent cx="3924300" cy="5699125"/>
+            <wp:effectExtent l="0" t="0" r="0" b="6350"/>
+            <wp:docPr id="11" name="图片 11" descr="interview-workbench"/>
             <wp:cNvGraphicFramePr>
               <a:graphicFrameLocks xmlns:a="http://schemas.openxmlformats.org/drawingml/2006/main" noChangeAspect="1"/>
             </wp:cNvGraphicFramePr>
@@ -9193,14 +9394,13 @@
               <a:graphicData uri="http://schemas.openxmlformats.org/drawingml/2006/picture">
                 <pic:pic xmlns:pic="http://schemas.openxmlformats.org/drawingml/2006/picture">
                   <pic:nvPicPr>
-                    <pic:cNvPr id="6" name="Picture 5" descr="E:/graduation-project/docs/images/interview-workbench.pnginterview-workbench"/>
+                    <pic:cNvPr id="11" name="图片 11" descr="interview-workbench"/>
                     <pic:cNvPicPr>
-                      <a:picLocks noChangeAspect="1" noChangeArrowheads="1"/>
+                      <a:picLocks noChangeAspect="1"/>
                     </pic:cNvPicPr>
                   </pic:nvPicPr>
                   <pic:blipFill>
                     <a:blip r:embed="rId27"/>
-                    <a:srcRect l="6" r="6"/>
                     <a:stretch>
                       <a:fillRect/>
                     </a:stretch>
@@ -9208,12 +9408,11 @@
                   <pic:spPr>
                     <a:xfrm>
                       <a:off x="0" y="0"/>
-                      <a:ext cx="4140200" cy="5635625"/>
+                      <a:ext cx="3924300" cy="5699125"/>
                     </a:xfrm>
                     <a:prstGeom prst="rect">
                       <a:avLst/>
                     </a:prstGeom>
-                    <a:noFill/>
                   </pic:spPr>
                 </pic:pic>
               </a:graphicData>
@@ -9241,7 +9440,50 @@
           <w:sz w:val="21"/>
           <w:szCs w:val="21"/>
         </w:rPr>
-        <w:t>附图 A.2 主工作台页面</w:t>
+        <w:t>附图 A.2 主工作台</w:t>
+      </w:r>
+      <w:r>
+        <w:rPr>
+          <w:rFonts w:hint="eastAsia" w:ascii="黑体" w:hAnsi="黑体" w:eastAsia="黑体" w:cs="黑体"/>
+          <w:b w:val="0"/>
+          <w:color w:val="000000"/>
+          <w:sz w:val="21"/>
+          <w:szCs w:val="21"/>
+          <w:lang w:eastAsia="zh-CN"/>
+        </w:rPr>
+        <w:t>（</w:t>
+      </w:r>
+      <w:r>
+        <w:rPr>
+          <w:rFonts w:hint="eastAsia" w:ascii="黑体" w:hAnsi="黑体" w:eastAsia="黑体" w:cs="黑体"/>
+          <w:b w:val="0"/>
+          <w:color w:val="000000"/>
+          <w:sz w:val="21"/>
+          <w:szCs w:val="21"/>
+          <w:lang w:val="en-US" w:eastAsia="zh-CN"/>
+        </w:rPr>
+        <w:t>报告预览</w:t>
+      </w:r>
+      <w:r>
+        <w:rPr>
+          <w:rFonts w:hint="eastAsia" w:ascii="黑体" w:hAnsi="黑体" w:eastAsia="黑体" w:cs="黑体"/>
+          <w:b w:val="0"/>
+          <w:color w:val="000000"/>
+          <w:sz w:val="21"/>
+          <w:szCs w:val="21"/>
+          <w:lang w:eastAsia="zh-CN"/>
+        </w:rPr>
+        <w:t>）</w:t>
+      </w:r>
+      <w:r>
+        <w:rPr>
+          <w:rFonts w:hint="eastAsia" w:ascii="黑体" w:hAnsi="黑体" w:eastAsia="黑体" w:cs="黑体"/>
+          <w:b w:val="0"/>
+          <w:color w:val="000000"/>
+          <w:sz w:val="21"/>
+          <w:szCs w:val="21"/>
+        </w:rPr>
+        <w:t>页面</w:t>
       </w:r>
     </w:p>
     <w:p>
@@ -9249,13 +9491,21 @@
         <w:spacing w:before="0" w:after="0" w:line="360" w:lineRule="auto"/>
         <w:ind w:firstLine="0"/>
         <w:jc w:val="center"/>
-      </w:pPr>
-      <w:r>
+        <w:rPr>
+          <w:rFonts w:hint="eastAsia" w:eastAsia="宋体"/>
+          <w:lang w:eastAsia="zh-CN"/>
+        </w:rPr>
+      </w:pPr>
+      <w:r>
+        <w:rPr>
+          <w:rFonts w:hint="eastAsia" w:eastAsia="宋体"/>
+          <w:lang w:eastAsia="zh-CN"/>
+        </w:rPr>
         <w:drawing>
-          <wp:inline distT="0" distB="0" distL="0" distR="0">
-            <wp:extent cx="4140200" cy="6019800"/>
-            <wp:effectExtent l="0" t="0" r="3175" b="0"/>
-            <wp:docPr id="7" name="Picture 6" descr="E:/graduation-project/docs/images/interview-report.pnginterview-report"/>
+          <wp:inline distT="0" distB="0" distL="114300" distR="114300">
+            <wp:extent cx="3924300" cy="8426450"/>
+            <wp:effectExtent l="0" t="0" r="0" b="3175"/>
+            <wp:docPr id="13" name="图片 13" descr="replay"/>
             <wp:cNvGraphicFramePr>
               <a:graphicFrameLocks xmlns:a="http://schemas.openxmlformats.org/drawingml/2006/main" noChangeAspect="1"/>
             </wp:cNvGraphicFramePr>
@@ -9263,14 +9513,13 @@
               <a:graphicData uri="http://schemas.openxmlformats.org/drawingml/2006/picture">
                 <pic:pic xmlns:pic="http://schemas.openxmlformats.org/drawingml/2006/picture">
                   <pic:nvPicPr>
-                    <pic:cNvPr id="7" name="Picture 6" descr="E:/graduation-project/docs/images/interview-report.pnginterview-report"/>
+                    <pic:cNvPr id="13" name="图片 13" descr="replay"/>
                     <pic:cNvPicPr>
-                      <a:picLocks noChangeAspect="1" noChangeArrowheads="1"/>
+                      <a:picLocks noChangeAspect="1"/>
                     </pic:cNvPicPr>
                   </pic:nvPicPr>
                   <pic:blipFill>
                     <a:blip r:embed="rId28"/>
-                    <a:srcRect t="8" b="8"/>
                     <a:stretch>
                       <a:fillRect/>
                     </a:stretch>
@@ -9278,12 +9527,11 @@
                   <pic:spPr>
                     <a:xfrm>
                       <a:off x="0" y="0"/>
-                      <a:ext cx="4140200" cy="6019800"/>
+                      <a:ext cx="3924300" cy="8426450"/>
                     </a:xfrm>
                     <a:prstGeom prst="rect">
                       <a:avLst/>
                     </a:prstGeom>
-                    <a:noFill/>
                   </pic:spPr>
                 </pic:pic>
               </a:graphicData>
@@ -9311,7 +9559,28 @@
           <w:sz w:val="21"/>
           <w:szCs w:val="21"/>
         </w:rPr>
-        <w:t>附图 A.3 报告预览页面</w:t>
+        <w:t>附图 A.</w:t>
+      </w:r>
+      <w:r>
+        <w:rPr>
+          <w:rFonts w:hint="eastAsia" w:ascii="黑体" w:hAnsi="黑体" w:eastAsia="黑体" w:cs="黑体"/>
+          <w:b w:val="0"/>
+          <w:color w:val="000000"/>
+          <w:sz w:val="21"/>
+          <w:szCs w:val="21"/>
+          <w:lang w:val="en-US" w:eastAsia="zh-CN"/>
+        </w:rPr>
+        <w:t>3</w:t>
+      </w:r>
+      <w:r>
+        <w:rPr>
+          <w:rFonts w:hint="eastAsia" w:ascii="黑体" w:hAnsi="黑体" w:eastAsia="黑体" w:cs="黑体"/>
+          <w:b w:val="0"/>
+          <w:color w:val="000000"/>
+          <w:sz w:val="21"/>
+          <w:szCs w:val="21"/>
+        </w:rPr>
+        <w:t xml:space="preserve"> 面试回放页面</w:t>
       </w:r>
     </w:p>
     <w:p>
@@ -9323,78 +9592,8 @@
       <w:r>
         <w:drawing>
           <wp:inline distT="0" distB="0" distL="0" distR="0">
-            <wp:extent cx="4140200" cy="8188960"/>
-            <wp:effectExtent l="0" t="0" r="3175" b="2540"/>
-            <wp:docPr id="8" name="Picture 7" descr="E:/graduation-project/docs/images/replay.pngreplay"/>
-            <wp:cNvGraphicFramePr>
-              <a:graphicFrameLocks xmlns:a="http://schemas.openxmlformats.org/drawingml/2006/main" noChangeAspect="1"/>
-            </wp:cNvGraphicFramePr>
-            <a:graphic xmlns:a="http://schemas.openxmlformats.org/drawingml/2006/main">
-              <a:graphicData uri="http://schemas.openxmlformats.org/drawingml/2006/picture">
-                <pic:pic xmlns:pic="http://schemas.openxmlformats.org/drawingml/2006/picture">
-                  <pic:nvPicPr>
-                    <pic:cNvPr id="8" name="Picture 7" descr="E:/graduation-project/docs/images/replay.pngreplay"/>
-                    <pic:cNvPicPr>
-                      <a:picLocks noChangeAspect="1" noChangeArrowheads="1"/>
-                    </pic:cNvPicPr>
-                  </pic:nvPicPr>
-                  <pic:blipFill>
-                    <a:blip r:embed="rId29"/>
-                    <a:srcRect l="7" r="7"/>
-                    <a:stretch>
-                      <a:fillRect/>
-                    </a:stretch>
-                  </pic:blipFill>
-                  <pic:spPr>
-                    <a:xfrm>
-                      <a:off x="0" y="0"/>
-                      <a:ext cx="4140200" cy="8188960"/>
-                    </a:xfrm>
-                    <a:prstGeom prst="rect">
-                      <a:avLst/>
-                    </a:prstGeom>
-                    <a:noFill/>
-                  </pic:spPr>
-                </pic:pic>
-              </a:graphicData>
-            </a:graphic>
-          </wp:inline>
-        </w:drawing>
-      </w:r>
-    </w:p>
-    <w:p>
-      <w:pPr>
-        <w:spacing w:before="0" w:after="0" w:line="360" w:lineRule="auto"/>
-        <w:ind w:firstLine="480"/>
-        <w:jc w:val="center"/>
-        <w:rPr>
-          <w:rFonts w:hint="eastAsia" w:ascii="黑体" w:hAnsi="黑体" w:eastAsia="黑体" w:cs="黑体"/>
-          <w:sz w:val="21"/>
-          <w:szCs w:val="21"/>
-        </w:rPr>
-      </w:pPr>
-      <w:r>
-        <w:rPr>
-          <w:rFonts w:hint="eastAsia" w:ascii="黑体" w:hAnsi="黑体" w:eastAsia="黑体" w:cs="黑体"/>
-          <w:b w:val="0"/>
-          <w:color w:val="000000"/>
-          <w:sz w:val="21"/>
-          <w:szCs w:val="21"/>
-        </w:rPr>
-        <w:t>附图 A.4 面试回放页面</w:t>
-      </w:r>
-    </w:p>
-    <w:p>
-      <w:pPr>
-        <w:spacing w:before="0" w:after="0" w:line="360" w:lineRule="auto"/>
-        <w:ind w:firstLine="0"/>
-        <w:jc w:val="center"/>
-      </w:pPr>
-      <w:r>
-        <w:drawing>
-          <wp:inline distT="0" distB="0" distL="0" distR="0">
-            <wp:extent cx="4140200" cy="4792345"/>
-            <wp:effectExtent l="0" t="0" r="3175" b="8255"/>
+            <wp:extent cx="3924300" cy="4542155"/>
+            <wp:effectExtent l="0" t="0" r="0" b="1270"/>
             <wp:docPr id="9" name="Picture 8" descr="E:/graduation-project/docs/images/analytics.pnganalytics"/>
             <wp:cNvGraphicFramePr>
               <a:graphicFrameLocks xmlns:a="http://schemas.openxmlformats.org/drawingml/2006/main" noChangeAspect="1"/>
@@ -9409,7 +9608,7 @@
                     </pic:cNvPicPr>
                   </pic:nvPicPr>
                   <pic:blipFill>
-                    <a:blip r:embed="rId30"/>
+                    <a:blip r:embed="rId29"/>
                     <a:srcRect t="8" b="8"/>
                     <a:stretch>
                       <a:fillRect/>
@@ -9418,7 +9617,7 @@
                   <pic:spPr>
                     <a:xfrm>
                       <a:off x="0" y="0"/>
-                      <a:ext cx="4140200" cy="4792345"/>
+                      <a:ext cx="3924300" cy="4542155"/>
                     </a:xfrm>
                     <a:prstGeom prst="rect">
                       <a:avLst/>
@@ -9451,7 +9650,28 @@
           <w:sz w:val="21"/>
           <w:szCs w:val="21"/>
         </w:rPr>
-        <w:t>附图 A.5 数据看板页面</w:t>
+        <w:t>附图 A.</w:t>
+      </w:r>
+      <w:r>
+        <w:rPr>
+          <w:rFonts w:hint="eastAsia" w:ascii="黑体" w:hAnsi="黑体" w:eastAsia="黑体" w:cs="黑体"/>
+          <w:b w:val="0"/>
+          <w:color w:val="000000"/>
+          <w:sz w:val="21"/>
+          <w:szCs w:val="21"/>
+          <w:lang w:val="en-US" w:eastAsia="zh-CN"/>
+        </w:rPr>
+        <w:t>4</w:t>
+      </w:r>
+      <w:r>
+        <w:rPr>
+          <w:rFonts w:hint="eastAsia" w:ascii="黑体" w:hAnsi="黑体" w:eastAsia="黑体" w:cs="黑体"/>
+          <w:b w:val="0"/>
+          <w:color w:val="000000"/>
+          <w:sz w:val="21"/>
+          <w:szCs w:val="21"/>
+        </w:rPr>
+        <w:t xml:space="preserve"> 数据看板页面</w:t>
       </w:r>
     </w:p>
     <w:p>
@@ -9462,7 +9682,7 @@
         <w:ind w:firstLine="0"/>
         <w:jc w:val="center"/>
       </w:pPr>
-      <w:bookmarkStart w:id="39" w:name="_Toc1867"/>
+      <w:bookmarkStart w:id="39" w:name="_Toc5874"/>
       <w:r>
         <w:rPr>
           <w:rFonts w:ascii="Times New Roman" w:hAnsi="Times New Roman" w:eastAsia="黑体" w:cs="黑体"/>
@@ -9497,7 +9717,7 @@
         <w:ind w:firstLine="480"/>
         <w:jc w:val="left"/>
       </w:pPr>
-      <w:bookmarkStart w:id="40" w:name="_Toc8960"/>
+      <w:bookmarkStart w:id="40" w:name="_Toc18849"/>
       <w:r>
         <w:rPr>
           <w:rFonts w:ascii="Times New Roman" w:hAnsi="Times New Roman" w:eastAsia="黑体" w:cs="黑体"/>
@@ -9670,7 +9890,7 @@
         <w:ind w:firstLine="480"/>
         <w:jc w:val="left"/>
       </w:pPr>
-      <w:bookmarkStart w:id="41" w:name="_Toc20898"/>
+      <w:bookmarkStart w:id="41" w:name="_Toc14225"/>
       <w:r>
         <w:rPr>
           <w:rFonts w:ascii="Times New Roman" w:hAnsi="Times New Roman" w:eastAsia="黑体" w:cs="黑体"/>
@@ -9821,7 +10041,7 @@
         <w:ind w:firstLine="480"/>
         <w:jc w:val="left"/>
       </w:pPr>
-      <w:bookmarkStart w:id="42" w:name="_Toc4517"/>
+      <w:bookmarkStart w:id="42" w:name="_Toc698"/>
       <w:r>
         <w:rPr>
           <w:rFonts w:ascii="Times New Roman" w:hAnsi="Times New Roman" w:eastAsia="黑体" w:cs="黑体"/>
@@ -9951,7 +10171,7 @@
         <w:ind w:firstLine="0"/>
         <w:jc w:val="center"/>
       </w:pPr>
-      <w:bookmarkStart w:id="43" w:name="_Toc14931"/>
+      <w:bookmarkStart w:id="43" w:name="_Toc11651"/>
       <w:r>
         <w:rPr>
           <w:rFonts w:ascii="Times New Roman" w:hAnsi="Times New Roman" w:eastAsia="黑体" w:cs="黑体"/>
@@ -9986,7 +10206,7 @@
         <w:ind w:firstLine="480"/>
         <w:jc w:val="left"/>
       </w:pPr>
-      <w:bookmarkStart w:id="44" w:name="_Toc24789"/>
+      <w:bookmarkStart w:id="44" w:name="_Toc26313"/>
       <w:r>
         <w:rPr>
           <w:rFonts w:ascii="Times New Roman" w:hAnsi="Times New Roman" w:eastAsia="黑体" w:cs="黑体"/>
@@ -10005,7 +10225,7 @@
         <w:ind w:firstLine="480"/>
         <w:jc w:val="left"/>
       </w:pPr>
-      <w:bookmarkStart w:id="45" w:name="_Toc15262"/>
+      <w:bookmarkStart w:id="45" w:name="_Toc12996"/>
       <w:r>
         <w:rPr>
           <w:rFonts w:ascii="Times New Roman" w:hAnsi="Times New Roman" w:eastAsia="黑体" w:cs="黑体"/>
@@ -10193,7 +10413,6 @@
         <w:t>PDF 上传/解析耗时为 Demo 模式下接口耗时，真实模式会额外受到 PDFBox 与 LLM 解析耗时影响。</w:t>
       </w:r>
     </w:p>
-    <w:bookmarkEnd w:id="46"/>
     <w:sectPr>
       <w:headerReference r:id="rId17" w:type="first"/>
       <w:footerReference r:id="rId20" w:type="first"/>
@@ -11383,7 +11602,7 @@
     <w:lsdException w:uiPriority="99" w:name="Normal Indent"/>
     <w:lsdException w:uiPriority="99" w:name="footnote text"/>
     <w:lsdException w:uiPriority="99" w:name="annotation text"/>
-    <w:lsdException w:uiPriority="99" w:semiHidden="0" w:name="header"/>
+    <w:lsdException w:qFormat="1" w:uiPriority="99" w:semiHidden="0" w:name="header"/>
     <w:lsdException w:uiPriority="99" w:semiHidden="0" w:name="footer"/>
     <w:lsdException w:unhideWhenUsed="0" w:uiPriority="0" w:semiHidden="0" w:name="index heading"/>
     <w:lsdException w:qFormat="1" w:uiPriority="35" w:name="caption"/>
@@ -11406,11 +11625,11 @@
     <w:lsdException w:qFormat="1" w:uiPriority="99" w:semiHidden="0" w:name="List 3"/>
     <w:lsdException w:uiPriority="99" w:name="List 4"/>
     <w:lsdException w:uiPriority="99" w:name="List 5"/>
-    <w:lsdException w:uiPriority="99" w:semiHidden="0" w:name="List Bullet 2"/>
-    <w:lsdException w:uiPriority="99" w:semiHidden="0" w:name="List Bullet 3"/>
+    <w:lsdException w:qFormat="1" w:uiPriority="99" w:semiHidden="0" w:name="List Bullet 2"/>
+    <w:lsdException w:qFormat="1" w:uiPriority="99" w:semiHidden="0" w:name="List Bullet 3"/>
     <w:lsdException w:uiPriority="99" w:name="List Bullet 4"/>
     <w:lsdException w:uiPriority="99" w:name="List Bullet 5"/>
-    <w:lsdException w:uiPriority="99" w:semiHidden="0" w:name="List Number 2"/>
+    <w:lsdException w:qFormat="1" w:uiPriority="99" w:semiHidden="0" w:name="List Number 2"/>
     <w:lsdException w:qFormat="1" w:uiPriority="99" w:semiHidden="0" w:name="List Number 3"/>
     <w:lsdException w:uiPriority="99" w:name="List Number 4"/>
     <w:lsdException w:uiPriority="99" w:name="List Number 5"/>
@@ -11418,10 +11637,10 @@
     <w:lsdException w:uiPriority="99" w:name="Closing"/>
     <w:lsdException w:uiPriority="99" w:name="Signature"/>
     <w:lsdException w:qFormat="1" w:uiPriority="1" w:name="Default Paragraph Font"/>
-    <w:lsdException w:uiPriority="99" w:semiHidden="0" w:name="Body Text"/>
+    <w:lsdException w:qFormat="1" w:uiPriority="99" w:semiHidden="0" w:name="Body Text"/>
     <w:lsdException w:uiPriority="99" w:name="Body Text Indent"/>
-    <w:lsdException w:uiPriority="99" w:semiHidden="0" w:name="List Continue"/>
-    <w:lsdException w:uiPriority="99" w:semiHidden="0" w:name="List Continue 2"/>
+    <w:lsdException w:qFormat="1" w:uiPriority="99" w:semiHidden="0" w:name="List Continue"/>
+    <w:lsdException w:qFormat="1" w:uiPriority="99" w:semiHidden="0" w:name="List Continue 2"/>
     <w:lsdException w:uiPriority="99" w:semiHidden="0" w:name="List Continue 3"/>
     <w:lsdException w:uiPriority="99" w:name="List Continue 4"/>
     <w:lsdException w:uiPriority="99" w:name="List Continue 5"/>
@@ -11500,42 +11719,42 @@
     <w:lsdException w:uiPriority="99" w:name="Table Web 2"/>
     <w:lsdException w:uiPriority="99" w:name="Table Web 3"/>
     <w:lsdException w:uiPriority="99" w:name="Balloon Text"/>
-    <w:lsdException w:unhideWhenUsed="0" w:uiPriority="59" w:semiHidden="0" w:name="Table Grid"/>
+    <w:lsdException w:qFormat="1" w:unhideWhenUsed="0" w:uiPriority="59" w:semiHidden="0" w:name="Table Grid"/>
     <w:lsdException w:uiPriority="99" w:name="Table Theme"/>
     <w:lsdException w:qFormat="1" w:unhideWhenUsed="0" w:uiPriority="1" w:semiHidden="0" w:name="No Spacing"/>
     <w:lsdException w:unhideWhenUsed="0" w:uiPriority="60" w:semiHidden="0" w:name="Light Shading"/>
     <w:lsdException w:unhideWhenUsed="0" w:uiPriority="61" w:semiHidden="0" w:name="Light List"/>
     <w:lsdException w:unhideWhenUsed="0" w:uiPriority="62" w:semiHidden="0" w:name="Light Grid"/>
     <w:lsdException w:unhideWhenUsed="0" w:uiPriority="63" w:semiHidden="0" w:name="Medium Shading 1"/>
-    <w:lsdException w:unhideWhenUsed="0" w:uiPriority="64" w:semiHidden="0" w:name="Medium Shading 2"/>
-    <w:lsdException w:unhideWhenUsed="0" w:uiPriority="65" w:semiHidden="0" w:name="Medium List 1"/>
+    <w:lsdException w:qFormat="1" w:unhideWhenUsed="0" w:uiPriority="64" w:semiHidden="0" w:name="Medium Shading 2"/>
+    <w:lsdException w:qFormat="1" w:unhideWhenUsed="0" w:uiPriority="65" w:semiHidden="0" w:name="Medium List 1"/>
     <w:lsdException w:qFormat="1" w:unhideWhenUsed="0" w:uiPriority="66" w:semiHidden="0" w:name="Medium List 2"/>
     <w:lsdException w:unhideWhenUsed="0" w:uiPriority="67" w:semiHidden="0" w:name="Medium Grid 1"/>
-    <w:lsdException w:unhideWhenUsed="0" w:uiPriority="68" w:semiHidden="0" w:name="Medium Grid 2"/>
+    <w:lsdException w:qFormat="1" w:unhideWhenUsed="0" w:uiPriority="68" w:semiHidden="0" w:name="Medium Grid 2"/>
     <w:lsdException w:unhideWhenUsed="0" w:uiPriority="69" w:semiHidden="0" w:name="Medium Grid 3"/>
-    <w:lsdException w:unhideWhenUsed="0" w:uiPriority="70" w:semiHidden="0" w:name="Dark List"/>
+    <w:lsdException w:qFormat="1" w:unhideWhenUsed="0" w:uiPriority="70" w:semiHidden="0" w:name="Dark List"/>
     <w:lsdException w:unhideWhenUsed="0" w:uiPriority="71" w:semiHidden="0" w:name="Colorful Shading"/>
     <w:lsdException w:unhideWhenUsed="0" w:uiPriority="72" w:semiHidden="0" w:name="Colorful List"/>
     <w:lsdException w:unhideWhenUsed="0" w:uiPriority="73" w:semiHidden="0" w:name="Colorful Grid"/>
-    <w:lsdException w:unhideWhenUsed="0" w:uiPriority="60" w:semiHidden="0" w:name="Light Shading Accent 1"/>
+    <w:lsdException w:qFormat="1" w:unhideWhenUsed="0" w:uiPriority="60" w:semiHidden="0" w:name="Light Shading Accent 1"/>
     <w:lsdException w:unhideWhenUsed="0" w:uiPriority="61" w:semiHidden="0" w:name="Light List Accent 1"/>
-    <w:lsdException w:unhideWhenUsed="0" w:uiPriority="62" w:semiHidden="0" w:name="Light Grid Accent 1"/>
-    <w:lsdException w:unhideWhenUsed="0" w:uiPriority="63" w:semiHidden="0" w:name="Medium Shading 1 Accent 1"/>
-    <w:lsdException w:unhideWhenUsed="0" w:uiPriority="64" w:semiHidden="0" w:name="Medium Shading 2 Accent 1"/>
+    <w:lsdException w:qFormat="1" w:unhideWhenUsed="0" w:uiPriority="62" w:semiHidden="0" w:name="Light Grid Accent 1"/>
+    <w:lsdException w:qFormat="1" w:unhideWhenUsed="0" w:uiPriority="63" w:semiHidden="0" w:name="Medium Shading 1 Accent 1"/>
+    <w:lsdException w:qFormat="1" w:unhideWhenUsed="0" w:uiPriority="64" w:semiHidden="0" w:name="Medium Shading 2 Accent 1"/>
     <w:lsdException w:unhideWhenUsed="0" w:uiPriority="65" w:semiHidden="0" w:name="Medium List 1 Accent 1"/>
     <w:lsdException w:qFormat="1" w:unhideWhenUsed="0" w:uiPriority="34" w:semiHidden="0" w:name="List Paragraph"/>
     <w:lsdException w:qFormat="1" w:unhideWhenUsed="0" w:uiPriority="29" w:semiHidden="0" w:name="Quote"/>
     <w:lsdException w:qFormat="1" w:unhideWhenUsed="0" w:uiPriority="30" w:semiHidden="0" w:name="Intense Quote"/>
-    <w:lsdException w:unhideWhenUsed="0" w:uiPriority="66" w:semiHidden="0" w:name="Medium List 2 Accent 1"/>
+    <w:lsdException w:qFormat="1" w:unhideWhenUsed="0" w:uiPriority="66" w:semiHidden="0" w:name="Medium List 2 Accent 1"/>
     <w:lsdException w:unhideWhenUsed="0" w:uiPriority="67" w:semiHidden="0" w:name="Medium Grid 1 Accent 1"/>
     <w:lsdException w:unhideWhenUsed="0" w:uiPriority="68" w:semiHidden="0" w:name="Medium Grid 2 Accent 1"/>
-    <w:lsdException w:unhideWhenUsed="0" w:uiPriority="69" w:semiHidden="0" w:name="Medium Grid 3 Accent 1"/>
-    <w:lsdException w:unhideWhenUsed="0" w:uiPriority="70" w:semiHidden="0" w:name="Dark List Accent 1"/>
+    <w:lsdException w:qFormat="1" w:unhideWhenUsed="0" w:uiPriority="69" w:semiHidden="0" w:name="Medium Grid 3 Accent 1"/>
+    <w:lsdException w:qFormat="1" w:unhideWhenUsed="0" w:uiPriority="70" w:semiHidden="0" w:name="Dark List Accent 1"/>
     <w:lsdException w:unhideWhenUsed="0" w:uiPriority="71" w:semiHidden="0" w:name="Colorful Shading Accent 1"/>
     <w:lsdException w:unhideWhenUsed="0" w:uiPriority="72" w:semiHidden="0" w:name="Colorful List Accent 1"/>
     <w:lsdException w:unhideWhenUsed="0" w:uiPriority="73" w:semiHidden="0" w:name="Colorful Grid Accent 1"/>
     <w:lsdException w:unhideWhenUsed="0" w:uiPriority="60" w:semiHidden="0" w:name="Light Shading Accent 2"/>
-    <w:lsdException w:unhideWhenUsed="0" w:uiPriority="61" w:semiHidden="0" w:name="Light List Accent 2"/>
+    <w:lsdException w:qFormat="1" w:unhideWhenUsed="0" w:uiPriority="61" w:semiHidden="0" w:name="Light List Accent 2"/>
     <w:lsdException w:unhideWhenUsed="0" w:uiPriority="62" w:semiHidden="0" w:name="Light Grid Accent 2"/>
     <w:lsdException w:qFormat="1" w:unhideWhenUsed="0" w:uiPriority="63" w:semiHidden="0" w:name="Medium Shading 1 Accent 2"/>
     <w:lsdException w:unhideWhenUsed="0" w:uiPriority="64" w:semiHidden="0" w:name="Medium Shading 2 Accent 2"/>
@@ -11545,56 +11764,56 @@
     <w:lsdException w:unhideWhenUsed="0" w:uiPriority="68" w:semiHidden="0" w:name="Medium Grid 2 Accent 2"/>
     <w:lsdException w:unhideWhenUsed="0" w:uiPriority="69" w:semiHidden="0" w:name="Medium Grid 3 Accent 2"/>
     <w:lsdException w:unhideWhenUsed="0" w:uiPriority="70" w:semiHidden="0" w:name="Dark List Accent 2"/>
-    <w:lsdException w:unhideWhenUsed="0" w:uiPriority="71" w:semiHidden="0" w:name="Colorful Shading Accent 2"/>
-    <w:lsdException w:unhideWhenUsed="0" w:uiPriority="72" w:semiHidden="0" w:name="Colorful List Accent 2"/>
-    <w:lsdException w:unhideWhenUsed="0" w:uiPriority="73" w:semiHidden="0" w:name="Colorful Grid Accent 2"/>
-    <w:lsdException w:unhideWhenUsed="0" w:uiPriority="60" w:semiHidden="0" w:name="Light Shading Accent 3"/>
-    <w:lsdException w:unhideWhenUsed="0" w:uiPriority="61" w:semiHidden="0" w:name="Light List Accent 3"/>
+    <w:lsdException w:qFormat="1" w:unhideWhenUsed="0" w:uiPriority="71" w:semiHidden="0" w:name="Colorful Shading Accent 2"/>
+    <w:lsdException w:qFormat="1" w:unhideWhenUsed="0" w:uiPriority="72" w:semiHidden="0" w:name="Colorful List Accent 2"/>
+    <w:lsdException w:qFormat="1" w:unhideWhenUsed="0" w:uiPriority="73" w:semiHidden="0" w:name="Colorful Grid Accent 2"/>
+    <w:lsdException w:qFormat="1" w:unhideWhenUsed="0" w:uiPriority="60" w:semiHidden="0" w:name="Light Shading Accent 3"/>
+    <w:lsdException w:qFormat="1" w:unhideWhenUsed="0" w:uiPriority="61" w:semiHidden="0" w:name="Light List Accent 3"/>
     <w:lsdException w:unhideWhenUsed="0" w:uiPriority="62" w:semiHidden="0" w:name="Light Grid Accent 3"/>
-    <w:lsdException w:unhideWhenUsed="0" w:uiPriority="63" w:semiHidden="0" w:name="Medium Shading 1 Accent 3"/>
-    <w:lsdException w:unhideWhenUsed="0" w:uiPriority="64" w:semiHidden="0" w:name="Medium Shading 2 Accent 3"/>
-    <w:lsdException w:unhideWhenUsed="0" w:uiPriority="65" w:semiHidden="0" w:name="Medium List 1 Accent 3"/>
+    <w:lsdException w:qFormat="1" w:unhideWhenUsed="0" w:uiPriority="63" w:semiHidden="0" w:name="Medium Shading 1 Accent 3"/>
+    <w:lsdException w:qFormat="1" w:unhideWhenUsed="0" w:uiPriority="64" w:semiHidden="0" w:name="Medium Shading 2 Accent 3"/>
+    <w:lsdException w:qFormat="1" w:unhideWhenUsed="0" w:uiPriority="65" w:semiHidden="0" w:name="Medium List 1 Accent 3"/>
     <w:lsdException w:unhideWhenUsed="0" w:uiPriority="66" w:semiHidden="0" w:name="Medium List 2 Accent 3"/>
     <w:lsdException w:qFormat="1" w:unhideWhenUsed="0" w:uiPriority="67" w:semiHidden="0" w:name="Medium Grid 1 Accent 3"/>
-    <w:lsdException w:unhideWhenUsed="0" w:uiPriority="68" w:semiHidden="0" w:name="Medium Grid 2 Accent 3"/>
-    <w:lsdException w:unhideWhenUsed="0" w:uiPriority="69" w:semiHidden="0" w:name="Medium Grid 3 Accent 3"/>
-    <w:lsdException w:unhideWhenUsed="0" w:uiPriority="70" w:semiHidden="0" w:name="Dark List Accent 3"/>
+    <w:lsdException w:qFormat="1" w:unhideWhenUsed="0" w:uiPriority="68" w:semiHidden="0" w:name="Medium Grid 2 Accent 3"/>
+    <w:lsdException w:qFormat="1" w:unhideWhenUsed="0" w:uiPriority="69" w:semiHidden="0" w:name="Medium Grid 3 Accent 3"/>
+    <w:lsdException w:qFormat="1" w:unhideWhenUsed="0" w:uiPriority="70" w:semiHidden="0" w:name="Dark List Accent 3"/>
     <w:lsdException w:unhideWhenUsed="0" w:uiPriority="71" w:semiHidden="0" w:name="Colorful Shading Accent 3"/>
     <w:lsdException w:unhideWhenUsed="0" w:uiPriority="72" w:semiHidden="0" w:name="Colorful List Accent 3"/>
-    <w:lsdException w:unhideWhenUsed="0" w:uiPriority="73" w:semiHidden="0" w:name="Colorful Grid Accent 3"/>
+    <w:lsdException w:qFormat="1" w:unhideWhenUsed="0" w:uiPriority="73" w:semiHidden="0" w:name="Colorful Grid Accent 3"/>
     <w:lsdException w:unhideWhenUsed="0" w:uiPriority="60" w:semiHidden="0" w:name="Light Shading Accent 4"/>
     <w:lsdException w:unhideWhenUsed="0" w:uiPriority="61" w:semiHidden="0" w:name="Light List Accent 4"/>
     <w:lsdException w:qFormat="1" w:unhideWhenUsed="0" w:uiPriority="62" w:semiHidden="0" w:name="Light Grid Accent 4"/>
     <w:lsdException w:unhideWhenUsed="0" w:uiPriority="63" w:semiHidden="0" w:name="Medium Shading 1 Accent 4"/>
     <w:lsdException w:qFormat="1" w:unhideWhenUsed="0" w:uiPriority="64" w:semiHidden="0" w:name="Medium Shading 2 Accent 4"/>
-    <w:lsdException w:unhideWhenUsed="0" w:uiPriority="65" w:semiHidden="0" w:name="Medium List 1 Accent 4"/>
+    <w:lsdException w:qFormat="1" w:unhideWhenUsed="0" w:uiPriority="65" w:semiHidden="0" w:name="Medium List 1 Accent 4"/>
     <w:lsdException w:unhideWhenUsed="0" w:uiPriority="66" w:semiHidden="0" w:name="Medium List 2 Accent 4"/>
     <w:lsdException w:unhideWhenUsed="0" w:uiPriority="67" w:semiHidden="0" w:name="Medium Grid 1 Accent 4"/>
     <w:lsdException w:unhideWhenUsed="0" w:uiPriority="68" w:semiHidden="0" w:name="Medium Grid 2 Accent 4"/>
-    <w:lsdException w:unhideWhenUsed="0" w:uiPriority="69" w:semiHidden="0" w:name="Medium Grid 3 Accent 4"/>
+    <w:lsdException w:qFormat="1" w:unhideWhenUsed="0" w:uiPriority="69" w:semiHidden="0" w:name="Medium Grid 3 Accent 4"/>
     <w:lsdException w:unhideWhenUsed="0" w:uiPriority="70" w:semiHidden="0" w:name="Dark List Accent 4"/>
     <w:lsdException w:unhideWhenUsed="0" w:uiPriority="71" w:semiHidden="0" w:name="Colorful Shading Accent 4"/>
     <w:lsdException w:qFormat="1" w:unhideWhenUsed="0" w:uiPriority="72" w:semiHidden="0" w:name="Colorful List Accent 4"/>
     <w:lsdException w:unhideWhenUsed="0" w:uiPriority="73" w:semiHidden="0" w:name="Colorful Grid Accent 4"/>
     <w:lsdException w:unhideWhenUsed="0" w:uiPriority="60" w:semiHidden="0" w:name="Light Shading Accent 5"/>
-    <w:lsdException w:unhideWhenUsed="0" w:uiPriority="61" w:semiHidden="0" w:name="Light List Accent 5"/>
+    <w:lsdException w:qFormat="1" w:unhideWhenUsed="0" w:uiPriority="61" w:semiHidden="0" w:name="Light List Accent 5"/>
     <w:lsdException w:qFormat="1" w:unhideWhenUsed="0" w:uiPriority="62" w:semiHidden="0" w:name="Light Grid Accent 5"/>
     <w:lsdException w:qFormat="1" w:unhideWhenUsed="0" w:uiPriority="63" w:semiHidden="0" w:name="Medium Shading 1 Accent 5"/>
-    <w:lsdException w:unhideWhenUsed="0" w:uiPriority="64" w:semiHidden="0" w:name="Medium Shading 2 Accent 5"/>
+    <w:lsdException w:qFormat="1" w:unhideWhenUsed="0" w:uiPriority="64" w:semiHidden="0" w:name="Medium Shading 2 Accent 5"/>
     <w:lsdException w:unhideWhenUsed="0" w:uiPriority="65" w:semiHidden="0" w:name="Medium List 1 Accent 5"/>
     <w:lsdException w:unhideWhenUsed="0" w:uiPriority="66" w:semiHidden="0" w:name="Medium List 2 Accent 5"/>
     <w:lsdException w:unhideWhenUsed="0" w:uiPriority="67" w:semiHidden="0" w:name="Medium Grid 1 Accent 5"/>
     <w:lsdException w:unhideWhenUsed="0" w:uiPriority="68" w:semiHidden="0" w:name="Medium Grid 2 Accent 5"/>
-    <w:lsdException w:unhideWhenUsed="0" w:uiPriority="69" w:semiHidden="0" w:name="Medium Grid 3 Accent 5"/>
-    <w:lsdException w:unhideWhenUsed="0" w:uiPriority="70" w:semiHidden="0" w:name="Dark List Accent 5"/>
-    <w:lsdException w:unhideWhenUsed="0" w:uiPriority="71" w:semiHidden="0" w:name="Colorful Shading Accent 5"/>
+    <w:lsdException w:qFormat="1" w:unhideWhenUsed="0" w:uiPriority="69" w:semiHidden="0" w:name="Medium Grid 3 Accent 5"/>
+    <w:lsdException w:qFormat="1" w:unhideWhenUsed="0" w:uiPriority="70" w:semiHidden="0" w:name="Dark List Accent 5"/>
+    <w:lsdException w:qFormat="1" w:unhideWhenUsed="0" w:uiPriority="71" w:semiHidden="0" w:name="Colorful Shading Accent 5"/>
     <w:lsdException w:unhideWhenUsed="0" w:uiPriority="72" w:semiHidden="0" w:name="Colorful List Accent 5"/>
     <w:lsdException w:unhideWhenUsed="0" w:uiPriority="73" w:semiHidden="0" w:name="Colorful Grid Accent 5"/>
     <w:lsdException w:unhideWhenUsed="0" w:uiPriority="60" w:semiHidden="0" w:name="Light Shading Accent 6"/>
     <w:lsdException w:unhideWhenUsed="0" w:uiPriority="61" w:semiHidden="0" w:name="Light List Accent 6"/>
-    <w:lsdException w:unhideWhenUsed="0" w:uiPriority="62" w:semiHidden="0" w:name="Light Grid Accent 6"/>
-    <w:lsdException w:unhideWhenUsed="0" w:uiPriority="63" w:semiHidden="0" w:name="Medium Shading 1 Accent 6"/>
-    <w:lsdException w:unhideWhenUsed="0" w:uiPriority="64" w:semiHidden="0" w:name="Medium Shading 2 Accent 6"/>
+    <w:lsdException w:qFormat="1" w:unhideWhenUsed="0" w:uiPriority="62" w:semiHidden="0" w:name="Light Grid Accent 6"/>
+    <w:lsdException w:qFormat="1" w:unhideWhenUsed="0" w:uiPriority="63" w:semiHidden="0" w:name="Medium Shading 1 Accent 6"/>
+    <w:lsdException w:qFormat="1" w:unhideWhenUsed="0" w:uiPriority="64" w:semiHidden="0" w:name="Medium Shading 2 Accent 6"/>
     <w:lsdException w:unhideWhenUsed="0" w:uiPriority="65" w:semiHidden="0" w:name="Medium List 1 Accent 6"/>
     <w:lsdException w:unhideWhenUsed="0" w:uiPriority="66" w:semiHidden="0" w:name="Medium List 2 Accent 6"/>
     <w:lsdException w:unhideWhenUsed="0" w:uiPriority="67" w:semiHidden="0" w:name="Medium Grid 1 Accent 6"/>
@@ -11895,6 +12114,7 @@
     <w:name w:val="List Number 2"/>
     <w:basedOn w:val="1"/>
     <w:unhideWhenUsed/>
+    <w:qFormat/>
     <w:uiPriority w:val="99"/>
     <w:pPr>
       <w:numPr>
@@ -11972,6 +12192,7 @@
     <w:name w:val="List Bullet 3"/>
     <w:basedOn w:val="1"/>
     <w:unhideWhenUsed/>
+    <w:qFormat/>
     <w:uiPriority w:val="99"/>
     <w:pPr>
       <w:numPr>
@@ -11987,6 +12208,7 @@
     <w:basedOn w:val="1"/>
     <w:link w:val="148"/>
     <w:unhideWhenUsed/>
+    <w:qFormat/>
     <w:uiPriority w:val="99"/>
     <w:pPr>
       <w:spacing w:before="0" w:after="120"/>
@@ -12023,6 +12245,7 @@
     <w:name w:val="List Continue"/>
     <w:basedOn w:val="1"/>
     <w:unhideWhenUsed/>
+    <w:qFormat/>
     <w:uiPriority w:val="99"/>
     <w:pPr>
       <w:spacing w:before="0" w:after="120"/>
@@ -12034,6 +12257,7 @@
     <w:name w:val="List Bullet 2"/>
     <w:basedOn w:val="1"/>
     <w:unhideWhenUsed/>
+    <w:qFormat/>
     <w:uiPriority w:val="99"/>
     <w:pPr>
       <w:numPr>
@@ -12063,6 +12287,7 @@
     <w:basedOn w:val="1"/>
     <w:link w:val="141"/>
     <w:unhideWhenUsed/>
+    <w:qFormat/>
     <w:uiPriority w:val="99"/>
     <w:pPr>
       <w:tabs>
@@ -12170,6 +12395,7 @@
     <w:name w:val="List Continue 2"/>
     <w:basedOn w:val="1"/>
     <w:unhideWhenUsed/>
+    <w:qFormat/>
     <w:uiPriority w:val="99"/>
     <w:pPr>
       <w:spacing w:before="0" w:after="120"/>
@@ -12214,6 +12440,7 @@
   <w:style w:type="table" w:styleId="38">
     <w:name w:val="Table Grid"/>
     <w:basedOn w:val="37"/>
+    <w:qFormat/>
     <w:uiPriority w:val="59"/>
     <w:pPr>
       <w:spacing w:after="0" w:line="240" w:lineRule="auto"/>
@@ -12337,6 +12564,7 @@
   <w:style w:type="table" w:styleId="40">
     <w:name w:val="Light Shading Accent 1"/>
     <w:basedOn w:val="37"/>
+    <w:qFormat/>
     <w:uiPriority w:val="60"/>
     <w:pPr>
       <w:spacing w:after="0" w:line="240" w:lineRule="auto"/>
@@ -12535,6 +12763,7 @@
   <w:style w:type="table" w:styleId="42">
     <w:name w:val="Light Shading Accent 3"/>
     <w:basedOn w:val="37"/>
+    <w:qFormat/>
     <w:uiPriority w:val="60"/>
     <w:pPr>
       <w:spacing w:after="0" w:line="240" w:lineRule="auto"/>
@@ -13107,6 +13336,7 @@
   <w:style w:type="table" w:styleId="48">
     <w:name w:val="Light List Accent 2"/>
     <w:basedOn w:val="37"/>
+    <w:qFormat/>
     <w:uiPriority w:val="61"/>
     <w:pPr>
       <w:spacing w:after="0" w:line="240" w:lineRule="auto"/>
@@ -13195,6 +13425,7 @@
   <w:style w:type="table" w:styleId="49">
     <w:name w:val="Light List Accent 3"/>
     <w:basedOn w:val="37"/>
+    <w:qFormat/>
     <w:uiPriority w:val="61"/>
     <w:pPr>
       <w:spacing w:after="0" w:line="240" w:lineRule="auto"/>
@@ -13371,6 +13602,7 @@
   <w:style w:type="table" w:styleId="51">
     <w:name w:val="Light List Accent 5"/>
     <w:basedOn w:val="37"/>
+    <w:qFormat/>
     <w:uiPriority w:val="61"/>
     <w:pPr>
       <w:spacing w:after="0" w:line="240" w:lineRule="auto"/>
@@ -13673,6 +13905,7 @@
   <w:style w:type="table" w:styleId="54">
     <w:name w:val="Light Grid Accent 1"/>
     <w:basedOn w:val="37"/>
+    <w:qFormat/>
     <w:uiPriority w:val="62"/>
     <w:pPr>
       <w:spacing w:after="0" w:line="240" w:lineRule="auto"/>
@@ -14305,6 +14538,7 @@
   <w:style w:type="table" w:styleId="59">
     <w:name w:val="Light Grid Accent 6"/>
     <w:basedOn w:val="37"/>
+    <w:qFormat/>
     <w:uiPriority w:val="62"/>
     <w:pPr>
       <w:spacing w:after="0" w:line="240" w:lineRule="auto"/>
@@ -14533,6 +14767,7 @@
   <w:style w:type="table" w:styleId="61">
     <w:name w:val="Medium Shading 1 Accent 1"/>
     <w:basedOn w:val="37"/>
+    <w:qFormat/>
     <w:uiPriority w:val="63"/>
     <w:pPr>
       <w:spacing w:after="0" w:line="240" w:lineRule="auto"/>
@@ -14738,6 +14973,7 @@
   <w:style w:type="table" w:styleId="63">
     <w:name w:val="Medium Shading 1 Accent 3"/>
     <w:basedOn w:val="37"/>
+    <w:qFormat/>
     <w:uiPriority w:val="63"/>
     <w:pPr>
       <w:spacing w:after="0" w:line="240" w:lineRule="auto"/>
@@ -15045,6 +15281,7 @@
   <w:style w:type="table" w:styleId="66">
     <w:name w:val="Medium Shading 1 Accent 6"/>
     <w:basedOn w:val="37"/>
+    <w:qFormat/>
     <w:uiPriority w:val="63"/>
     <w:pPr>
       <w:spacing w:after="0" w:line="240" w:lineRule="auto"/>
@@ -15147,6 +15384,7 @@
   <w:style w:type="table" w:styleId="67">
     <w:name w:val="Medium Shading 2"/>
     <w:basedOn w:val="37"/>
+    <w:qFormat/>
     <w:uiPriority w:val="64"/>
     <w:pPr>
       <w:spacing w:after="0" w:line="240" w:lineRule="auto"/>
@@ -15292,6 +15530,7 @@
   <w:style w:type="table" w:styleId="68">
     <w:name w:val="Medium Shading 2 Accent 1"/>
     <w:basedOn w:val="37"/>
+    <w:qFormat/>
     <w:uiPriority w:val="64"/>
     <w:pPr>
       <w:spacing w:after="0" w:line="240" w:lineRule="auto"/>
@@ -15582,6 +15821,7 @@
   <w:style w:type="table" w:styleId="70">
     <w:name w:val="Medium Shading 2 Accent 3"/>
     <w:basedOn w:val="37"/>
+    <w:qFormat/>
     <w:uiPriority w:val="64"/>
     <w:pPr>
       <w:spacing w:after="0" w:line="240" w:lineRule="auto"/>
@@ -15873,6 +16113,7 @@
   <w:style w:type="table" w:styleId="72">
     <w:name w:val="Medium Shading 2 Accent 5"/>
     <w:basedOn w:val="37"/>
+    <w:qFormat/>
     <w:uiPriority w:val="64"/>
     <w:pPr>
       <w:spacing w:after="0" w:line="240" w:lineRule="auto"/>
@@ -16018,6 +16259,7 @@
   <w:style w:type="table" w:styleId="73">
     <w:name w:val="Medium Shading 2 Accent 6"/>
     <w:basedOn w:val="37"/>
+    <w:qFormat/>
     <w:uiPriority w:val="64"/>
     <w:pPr>
       <w:spacing w:after="0" w:line="240" w:lineRule="auto"/>
@@ -16163,6 +16405,7 @@
   <w:style w:type="table" w:styleId="74">
     <w:name w:val="Medium List 1"/>
     <w:basedOn w:val="37"/>
+    <w:qFormat/>
     <w:uiPriority w:val="65"/>
     <w:pPr>
       <w:spacing w:after="0" w:line="240" w:lineRule="auto"/>
@@ -16403,6 +16646,7 @@
   <w:style w:type="table" w:styleId="77">
     <w:name w:val="Medium List 1 Accent 3"/>
     <w:basedOn w:val="37"/>
+    <w:qFormat/>
     <w:uiPriority w:val="65"/>
     <w:pPr>
       <w:spacing w:after="0" w:line="240" w:lineRule="auto"/>
@@ -16483,6 +16727,7 @@
   <w:style w:type="table" w:styleId="78">
     <w:name w:val="Medium List 1 Accent 4"/>
     <w:basedOn w:val="37"/>
+    <w:qFormat/>
     <w:uiPriority w:val="65"/>
     <w:pPr>
       <w:spacing w:after="0" w:line="240" w:lineRule="auto"/>
@@ -16848,6 +17093,7 @@
   <w:style w:type="table" w:styleId="82">
     <w:name w:val="Medium List 2 Accent 1"/>
     <w:basedOn w:val="37"/>
+    <w:qFormat/>
     <w:uiPriority w:val="66"/>
     <w:pPr>
       <w:spacing w:after="0" w:line="240" w:lineRule="auto"/>
@@ -18076,6 +18322,7 @@
   <w:style w:type="table" w:styleId="95">
     <w:name w:val="Medium Grid 2"/>
     <w:basedOn w:val="37"/>
+    <w:qFormat/>
     <w:uiPriority w:val="68"/>
     <w:pPr>
       <w:spacing w:after="0" w:line="240" w:lineRule="auto"/>
@@ -18439,6 +18686,7 @@
   <w:style w:type="table" w:styleId="98">
     <w:name w:val="Medium Grid 2 Accent 3"/>
     <w:basedOn w:val="37"/>
+    <w:qFormat/>
     <w:uiPriority w:val="68"/>
     <w:pPr>
       <w:spacing w:after="0" w:line="240" w:lineRule="auto"/>
@@ -19056,6 +19304,7 @@
   <w:style w:type="table" w:styleId="103">
     <w:name w:val="Medium Grid 3 Accent 1"/>
     <w:basedOn w:val="37"/>
+    <w:qFormat/>
     <w:uiPriority w:val="69"/>
     <w:pPr>
       <w:spacing w:after="0" w:line="240" w:lineRule="auto"/>
@@ -19322,6 +19571,7 @@
   <w:style w:type="table" w:styleId="105">
     <w:name w:val="Medium Grid 3 Accent 3"/>
     <w:basedOn w:val="37"/>
+    <w:qFormat/>
     <w:uiPriority w:val="69"/>
     <w:pPr>
       <w:spacing w:after="0" w:line="240" w:lineRule="auto"/>
@@ -19455,6 +19705,7 @@
   <w:style w:type="table" w:styleId="106">
     <w:name w:val="Medium Grid 3 Accent 4"/>
     <w:basedOn w:val="37"/>
+    <w:qFormat/>
     <w:uiPriority w:val="69"/>
     <w:pPr>
       <w:spacing w:after="0" w:line="240" w:lineRule="auto"/>
@@ -19588,6 +19839,7 @@
   <w:style w:type="table" w:styleId="107">
     <w:name w:val="Medium Grid 3 Accent 5"/>
     <w:basedOn w:val="37"/>
+    <w:qFormat/>
     <w:uiPriority w:val="69"/>
     <w:pPr>
       <w:spacing w:after="0" w:line="240" w:lineRule="auto"/>
@@ -19854,6 +20106,7 @@
   <w:style w:type="table" w:styleId="109">
     <w:name w:val="Dark List"/>
     <w:basedOn w:val="37"/>
+    <w:qFormat/>
     <w:uiPriority w:val="70"/>
     <w:pPr>
       <w:spacing w:after="0" w:line="240" w:lineRule="auto"/>
@@ -19964,6 +20217,7 @@
   <w:style w:type="table" w:styleId="110">
     <w:name w:val="Dark List Accent 1"/>
     <w:basedOn w:val="37"/>
+    <w:qFormat/>
     <w:uiPriority w:val="70"/>
     <w:pPr>
       <w:spacing w:after="0" w:line="240" w:lineRule="auto"/>
@@ -20184,6 +20438,7 @@
   <w:style w:type="table" w:styleId="112">
     <w:name w:val="Dark List Accent 3"/>
     <w:basedOn w:val="37"/>
+    <w:qFormat/>
     <w:uiPriority w:val="70"/>
     <w:pPr>
       <w:spacing w:after="0" w:line="240" w:lineRule="auto"/>
@@ -20404,6 +20659,7 @@
   <w:style w:type="table" w:styleId="114">
     <w:name w:val="Dark List Accent 5"/>
     <w:basedOn w:val="37"/>
+    <w:qFormat/>
     <w:uiPriority w:val="70"/>
     <w:pPr>
       <w:spacing w:after="0" w:line="240" w:lineRule="auto"/>
@@ -20860,6 +21116,7 @@
   <w:style w:type="table" w:styleId="118">
     <w:name w:val="Colorful Shading Accent 2"/>
     <w:basedOn w:val="37"/>
+    <w:qFormat/>
     <w:uiPriority w:val="71"/>
     <w:pPr>
       <w:spacing w:after="0" w:line="240" w:lineRule="auto"/>
@@ -21204,6 +21461,7 @@
   <w:style w:type="table" w:styleId="121">
     <w:name w:val="Colorful Shading Accent 5"/>
     <w:basedOn w:val="37"/>
+    <w:qFormat/>
     <w:uiPriority w:val="71"/>
     <w:pPr>
       <w:spacing w:after="0" w:line="240" w:lineRule="auto"/>
@@ -21604,6 +21862,7 @@
   <w:style w:type="table" w:styleId="125">
     <w:name w:val="Colorful List Accent 2"/>
     <w:basedOn w:val="37"/>
+    <w:qFormat/>
     <w:uiPriority w:val="72"/>
     <w:pPr>
       <w:spacing w:after="0" w:line="240" w:lineRule="auto"/>
@@ -22167,6 +22426,7 @@
   <w:style w:type="table" w:styleId="132">
     <w:name w:val="Colorful Grid Accent 2"/>
     <w:basedOn w:val="37"/>
+    <w:qFormat/>
     <w:uiPriority w:val="73"/>
     <w:pPr>
       <w:spacing w:after="0" w:line="240" w:lineRule="auto"/>
@@ -22243,6 +22503,7 @@
   <w:style w:type="table" w:styleId="133">
     <w:name w:val="Colorful Grid Accent 3"/>
     <w:basedOn w:val="37"/>
+    <w:qFormat/>
     <w:uiPriority w:val="73"/>
     <w:pPr>
       <w:spacing w:after="0" w:line="240" w:lineRule="auto"/>

</xml_diff>

<commit_message>
Sync Node 24 evidence and frontend chunks
</commit_message>
<xml_diff>
--- a/thesis-assets/毕业论文正式版（草稿）.docx
+++ b/thesis-assets/毕业论文正式版（草稿）.docx
@@ -8,6 +8,7 @@
         <w:ind w:firstLine="0"/>
         <w:jc w:val="center"/>
       </w:pPr>
+      <w:bookmarkStart w:id="46" w:name="_GoBack"/>
       <w:r>
         <w:drawing>
           <wp:inline distT="0" distB="0" distL="114300" distR="114300">
@@ -865,10 +866,10 @@
       <w:sdtContent>
         <w:p>
           <w:pPr>
-            <w:pStyle w:val="32"/>
+            <w:pStyle w:val="26"/>
             <w:tabs>
               <w:tab w:val="right" w:leader="dot" w:pos="9070"/>
-              <w:tab w:val="clear" w:pos="8788"/>
+              <w:tab w:val="clear" w:pos="9071"/>
             </w:tabs>
             <w:rPr>
               <w:rFonts w:ascii="Times New Roman" w:hAnsi="Times New Roman" w:eastAsia="宋体" w:cs="Lohit Devanagari"/>
@@ -903,7 +904,7 @@
             <w:fldChar w:fldCharType="begin"/>
           </w:r>
           <w:r>
-            <w:instrText xml:space="preserve"> HYPERLINK \l _Toc12533 </w:instrText>
+            <w:instrText xml:space="preserve"> HYPERLINK \l _Toc1732 </w:instrText>
           </w:r>
           <w:r>
             <w:fldChar w:fldCharType="separate"/>
@@ -921,7 +922,7 @@
             <w:fldChar w:fldCharType="begin"/>
           </w:r>
           <w:r>
-            <w:instrText xml:space="preserve"> PAGEREF _Toc12533 \h </w:instrText>
+            <w:instrText xml:space="preserve"> PAGEREF _Toc1732 \h </w:instrText>
           </w:r>
           <w:r>
             <w:fldChar w:fldCharType="separate"/>
@@ -944,7 +945,7 @@
             <w:fldChar w:fldCharType="begin"/>
           </w:r>
           <w:r>
-            <w:instrText xml:space="preserve"> HYPERLINK \l _Toc14575 </w:instrText>
+            <w:instrText xml:space="preserve"> HYPERLINK \l _Toc3905 </w:instrText>
           </w:r>
           <w:r>
             <w:fldChar w:fldCharType="separate"/>
@@ -962,7 +963,7 @@
             <w:fldChar w:fldCharType="begin"/>
           </w:r>
           <w:r>
-            <w:instrText xml:space="preserve"> PAGEREF _Toc14575 \h </w:instrText>
+            <w:instrText xml:space="preserve"> PAGEREF _Toc3905 \h </w:instrText>
           </w:r>
           <w:r>
             <w:fldChar w:fldCharType="separate"/>
@@ -985,7 +986,7 @@
             <w:fldChar w:fldCharType="begin"/>
           </w:r>
           <w:r>
-            <w:instrText xml:space="preserve"> HYPERLINK \l _Toc1850 </w:instrText>
+            <w:instrText xml:space="preserve"> HYPERLINK \l _Toc3871 </w:instrText>
           </w:r>
           <w:r>
             <w:fldChar w:fldCharType="separate"/>
@@ -1003,7 +1004,7 @@
             <w:fldChar w:fldCharType="begin"/>
           </w:r>
           <w:r>
-            <w:instrText xml:space="preserve"> PAGEREF _Toc1850 \h </w:instrText>
+            <w:instrText xml:space="preserve"> PAGEREF _Toc3871 \h </w:instrText>
           </w:r>
           <w:r>
             <w:fldChar w:fldCharType="separate"/>
@@ -1030,7 +1031,7 @@
             <w:fldChar w:fldCharType="begin"/>
           </w:r>
           <w:r>
-            <w:instrText xml:space="preserve"> HYPERLINK \l _Toc14878 </w:instrText>
+            <w:instrText xml:space="preserve"> HYPERLINK \l _Toc3000 </w:instrText>
           </w:r>
           <w:r>
             <w:fldChar w:fldCharType="separate"/>
@@ -1048,7 +1049,7 @@
             <w:fldChar w:fldCharType="begin"/>
           </w:r>
           <w:r>
-            <w:instrText xml:space="preserve"> PAGEREF _Toc14878 \h </w:instrText>
+            <w:instrText xml:space="preserve"> PAGEREF _Toc3000 \h </w:instrText>
           </w:r>
           <w:r>
             <w:fldChar w:fldCharType="separate"/>
@@ -1075,7 +1076,7 @@
             <w:fldChar w:fldCharType="begin"/>
           </w:r>
           <w:r>
-            <w:instrText xml:space="preserve"> HYPERLINK \l _Toc5848 </w:instrText>
+            <w:instrText xml:space="preserve"> HYPERLINK \l _Toc2242 </w:instrText>
           </w:r>
           <w:r>
             <w:fldChar w:fldCharType="separate"/>
@@ -1093,7 +1094,7 @@
             <w:fldChar w:fldCharType="begin"/>
           </w:r>
           <w:r>
-            <w:instrText xml:space="preserve"> PAGEREF _Toc5848 \h </w:instrText>
+            <w:instrText xml:space="preserve"> PAGEREF _Toc2242 \h </w:instrText>
           </w:r>
           <w:r>
             <w:fldChar w:fldCharType="separate"/>
@@ -1120,7 +1121,7 @@
             <w:fldChar w:fldCharType="begin"/>
           </w:r>
           <w:r>
-            <w:instrText xml:space="preserve"> HYPERLINK \l _Toc29804 </w:instrText>
+            <w:instrText xml:space="preserve"> HYPERLINK \l _Toc17104 </w:instrText>
           </w:r>
           <w:r>
             <w:fldChar w:fldCharType="separate"/>
@@ -1138,7 +1139,7 @@
             <w:fldChar w:fldCharType="begin"/>
           </w:r>
           <w:r>
-            <w:instrText xml:space="preserve"> PAGEREF _Toc29804 \h </w:instrText>
+            <w:instrText xml:space="preserve"> PAGEREF _Toc17104 \h </w:instrText>
           </w:r>
           <w:r>
             <w:fldChar w:fldCharType="separate"/>
@@ -1165,7 +1166,7 @@
             <w:fldChar w:fldCharType="begin"/>
           </w:r>
           <w:r>
-            <w:instrText xml:space="preserve"> HYPERLINK \l _Toc17559 </w:instrText>
+            <w:instrText xml:space="preserve"> HYPERLINK \l _Toc9234 </w:instrText>
           </w:r>
           <w:r>
             <w:fldChar w:fldCharType="separate"/>
@@ -1183,7 +1184,7 @@
             <w:fldChar w:fldCharType="begin"/>
           </w:r>
           <w:r>
-            <w:instrText xml:space="preserve"> PAGEREF _Toc17559 \h </w:instrText>
+            <w:instrText xml:space="preserve"> PAGEREF _Toc9234 \h </w:instrText>
           </w:r>
           <w:r>
             <w:fldChar w:fldCharType="separate"/>
@@ -1206,7 +1207,7 @@
             <w:fldChar w:fldCharType="begin"/>
           </w:r>
           <w:r>
-            <w:instrText xml:space="preserve"> HYPERLINK \l _Toc3282 </w:instrText>
+            <w:instrText xml:space="preserve"> HYPERLINK \l _Toc10552 </w:instrText>
           </w:r>
           <w:r>
             <w:fldChar w:fldCharType="separate"/>
@@ -1224,7 +1225,7 @@
             <w:fldChar w:fldCharType="begin"/>
           </w:r>
           <w:r>
-            <w:instrText xml:space="preserve"> PAGEREF _Toc3282 \h </w:instrText>
+            <w:instrText xml:space="preserve"> PAGEREF _Toc10552 \h </w:instrText>
           </w:r>
           <w:r>
             <w:fldChar w:fldCharType="separate"/>
@@ -1251,7 +1252,7 @@
             <w:fldChar w:fldCharType="begin"/>
           </w:r>
           <w:r>
-            <w:instrText xml:space="preserve"> HYPERLINK \l _Toc28570 </w:instrText>
+            <w:instrText xml:space="preserve"> HYPERLINK \l _Toc22900 </w:instrText>
           </w:r>
           <w:r>
             <w:fldChar w:fldCharType="separate"/>
@@ -1269,7 +1270,7 @@
             <w:fldChar w:fldCharType="begin"/>
           </w:r>
           <w:r>
-            <w:instrText xml:space="preserve"> PAGEREF _Toc28570 \h </w:instrText>
+            <w:instrText xml:space="preserve"> PAGEREF _Toc22900 \h </w:instrText>
           </w:r>
           <w:r>
             <w:fldChar w:fldCharType="separate"/>
@@ -1296,7 +1297,7 @@
             <w:fldChar w:fldCharType="begin"/>
           </w:r>
           <w:r>
-            <w:instrText xml:space="preserve"> HYPERLINK \l _Toc9163 </w:instrText>
+            <w:instrText xml:space="preserve"> HYPERLINK \l _Toc6761 </w:instrText>
           </w:r>
           <w:r>
             <w:fldChar w:fldCharType="separate"/>
@@ -1314,7 +1315,7 @@
             <w:fldChar w:fldCharType="begin"/>
           </w:r>
           <w:r>
-            <w:instrText xml:space="preserve"> PAGEREF _Toc9163 \h </w:instrText>
+            <w:instrText xml:space="preserve"> PAGEREF _Toc6761 \h </w:instrText>
           </w:r>
           <w:r>
             <w:fldChar w:fldCharType="separate"/>
@@ -1341,7 +1342,7 @@
             <w:fldChar w:fldCharType="begin"/>
           </w:r>
           <w:r>
-            <w:instrText xml:space="preserve"> HYPERLINK \l _Toc1223 </w:instrText>
+            <w:instrText xml:space="preserve"> HYPERLINK \l _Toc28794 </w:instrText>
           </w:r>
           <w:r>
             <w:fldChar w:fldCharType="separate"/>
@@ -1359,7 +1360,7 @@
             <w:fldChar w:fldCharType="begin"/>
           </w:r>
           <w:r>
-            <w:instrText xml:space="preserve"> PAGEREF _Toc1223 \h </w:instrText>
+            <w:instrText xml:space="preserve"> PAGEREF _Toc28794 \h </w:instrText>
           </w:r>
           <w:r>
             <w:fldChar w:fldCharType="separate"/>
@@ -1386,7 +1387,7 @@
             <w:fldChar w:fldCharType="begin"/>
           </w:r>
           <w:r>
-            <w:instrText xml:space="preserve"> HYPERLINK \l _Toc28567 </w:instrText>
+            <w:instrText xml:space="preserve"> HYPERLINK \l _Toc14760 </w:instrText>
           </w:r>
           <w:r>
             <w:fldChar w:fldCharType="separate"/>
@@ -1404,7 +1405,7 @@
             <w:fldChar w:fldCharType="begin"/>
           </w:r>
           <w:r>
-            <w:instrText xml:space="preserve"> PAGEREF _Toc28567 \h </w:instrText>
+            <w:instrText xml:space="preserve"> PAGEREF _Toc14760 \h </w:instrText>
           </w:r>
           <w:r>
             <w:fldChar w:fldCharType="separate"/>
@@ -1431,7 +1432,7 @@
             <w:fldChar w:fldCharType="begin"/>
           </w:r>
           <w:r>
-            <w:instrText xml:space="preserve"> HYPERLINK \l _Toc12941 </w:instrText>
+            <w:instrText xml:space="preserve"> HYPERLINK \l _Toc31084 </w:instrText>
           </w:r>
           <w:r>
             <w:fldChar w:fldCharType="separate"/>
@@ -1449,7 +1450,7 @@
             <w:fldChar w:fldCharType="begin"/>
           </w:r>
           <w:r>
-            <w:instrText xml:space="preserve"> PAGEREF _Toc12941 \h </w:instrText>
+            <w:instrText xml:space="preserve"> PAGEREF _Toc31084 \h </w:instrText>
           </w:r>
           <w:r>
             <w:fldChar w:fldCharType="separate"/>
@@ -1472,7 +1473,7 @@
             <w:fldChar w:fldCharType="begin"/>
           </w:r>
           <w:r>
-            <w:instrText xml:space="preserve"> HYPERLINK \l _Toc6505 </w:instrText>
+            <w:instrText xml:space="preserve"> HYPERLINK \l _Toc12263 </w:instrText>
           </w:r>
           <w:r>
             <w:fldChar w:fldCharType="separate"/>
@@ -1490,7 +1491,7 @@
             <w:fldChar w:fldCharType="begin"/>
           </w:r>
           <w:r>
-            <w:instrText xml:space="preserve"> PAGEREF _Toc6505 \h </w:instrText>
+            <w:instrText xml:space="preserve"> PAGEREF _Toc12263 \h </w:instrText>
           </w:r>
           <w:r>
             <w:fldChar w:fldCharType="separate"/>
@@ -1517,7 +1518,7 @@
             <w:fldChar w:fldCharType="begin"/>
           </w:r>
           <w:r>
-            <w:instrText xml:space="preserve"> HYPERLINK \l _Toc26570 </w:instrText>
+            <w:instrText xml:space="preserve"> HYPERLINK \l _Toc5140 </w:instrText>
           </w:r>
           <w:r>
             <w:fldChar w:fldCharType="separate"/>
@@ -1535,7 +1536,7 @@
             <w:fldChar w:fldCharType="begin"/>
           </w:r>
           <w:r>
-            <w:instrText xml:space="preserve"> PAGEREF _Toc26570 \h </w:instrText>
+            <w:instrText xml:space="preserve"> PAGEREF _Toc5140 \h </w:instrText>
           </w:r>
           <w:r>
             <w:fldChar w:fldCharType="separate"/>
@@ -1562,7 +1563,7 @@
             <w:fldChar w:fldCharType="begin"/>
           </w:r>
           <w:r>
-            <w:instrText xml:space="preserve"> HYPERLINK \l _Toc32060 </w:instrText>
+            <w:instrText xml:space="preserve"> HYPERLINK \l _Toc21982 </w:instrText>
           </w:r>
           <w:r>
             <w:fldChar w:fldCharType="separate"/>
@@ -1580,7 +1581,7 @@
             <w:fldChar w:fldCharType="begin"/>
           </w:r>
           <w:r>
-            <w:instrText xml:space="preserve"> PAGEREF _Toc32060 \h </w:instrText>
+            <w:instrText xml:space="preserve"> PAGEREF _Toc21982 \h </w:instrText>
           </w:r>
           <w:r>
             <w:fldChar w:fldCharType="separate"/>
@@ -1607,7 +1608,7 @@
             <w:fldChar w:fldCharType="begin"/>
           </w:r>
           <w:r>
-            <w:instrText xml:space="preserve"> HYPERLINK \l _Toc24277 </w:instrText>
+            <w:instrText xml:space="preserve"> HYPERLINK \l _Toc30205 </w:instrText>
           </w:r>
           <w:r>
             <w:fldChar w:fldCharType="separate"/>
@@ -1625,7 +1626,7 @@
             <w:fldChar w:fldCharType="begin"/>
           </w:r>
           <w:r>
-            <w:instrText xml:space="preserve"> PAGEREF _Toc24277 \h </w:instrText>
+            <w:instrText xml:space="preserve"> PAGEREF _Toc30205 \h </w:instrText>
           </w:r>
           <w:r>
             <w:fldChar w:fldCharType="separate"/>
@@ -1652,7 +1653,7 @@
             <w:fldChar w:fldCharType="begin"/>
           </w:r>
           <w:r>
-            <w:instrText xml:space="preserve"> HYPERLINK \l _Toc10536 </w:instrText>
+            <w:instrText xml:space="preserve"> HYPERLINK \l _Toc5083 </w:instrText>
           </w:r>
           <w:r>
             <w:fldChar w:fldCharType="separate"/>
@@ -1670,7 +1671,7 @@
             <w:fldChar w:fldCharType="begin"/>
           </w:r>
           <w:r>
-            <w:instrText xml:space="preserve"> PAGEREF _Toc10536 \h </w:instrText>
+            <w:instrText xml:space="preserve"> PAGEREF _Toc5083 \h </w:instrText>
           </w:r>
           <w:r>
             <w:fldChar w:fldCharType="separate"/>
@@ -1693,7 +1694,7 @@
             <w:fldChar w:fldCharType="begin"/>
           </w:r>
           <w:r>
-            <w:instrText xml:space="preserve"> HYPERLINK \l _Toc15876 </w:instrText>
+            <w:instrText xml:space="preserve"> HYPERLINK \l _Toc29565 </w:instrText>
           </w:r>
           <w:r>
             <w:fldChar w:fldCharType="separate"/>
@@ -1711,7 +1712,7 @@
             <w:fldChar w:fldCharType="begin"/>
           </w:r>
           <w:r>
-            <w:instrText xml:space="preserve"> PAGEREF _Toc15876 \h </w:instrText>
+            <w:instrText xml:space="preserve"> PAGEREF _Toc29565 \h </w:instrText>
           </w:r>
           <w:r>
             <w:fldChar w:fldCharType="separate"/>
@@ -1738,7 +1739,7 @@
             <w:fldChar w:fldCharType="begin"/>
           </w:r>
           <w:r>
-            <w:instrText xml:space="preserve"> HYPERLINK \l _Toc8291 </w:instrText>
+            <w:instrText xml:space="preserve"> HYPERLINK \l _Toc19732 </w:instrText>
           </w:r>
           <w:r>
             <w:fldChar w:fldCharType="separate"/>
@@ -1756,7 +1757,7 @@
             <w:fldChar w:fldCharType="begin"/>
           </w:r>
           <w:r>
-            <w:instrText xml:space="preserve"> PAGEREF _Toc8291 \h </w:instrText>
+            <w:instrText xml:space="preserve"> PAGEREF _Toc19732 \h </w:instrText>
           </w:r>
           <w:r>
             <w:fldChar w:fldCharType="separate"/>
@@ -1783,7 +1784,7 @@
             <w:fldChar w:fldCharType="begin"/>
           </w:r>
           <w:r>
-            <w:instrText xml:space="preserve"> HYPERLINK \l _Toc24861 </w:instrText>
+            <w:instrText xml:space="preserve"> HYPERLINK \l _Toc10822 </w:instrText>
           </w:r>
           <w:r>
             <w:fldChar w:fldCharType="separate"/>
@@ -1801,7 +1802,7 @@
             <w:fldChar w:fldCharType="begin"/>
           </w:r>
           <w:r>
-            <w:instrText xml:space="preserve"> PAGEREF _Toc24861 \h </w:instrText>
+            <w:instrText xml:space="preserve"> PAGEREF _Toc10822 \h </w:instrText>
           </w:r>
           <w:r>
             <w:fldChar w:fldCharType="separate"/>
@@ -1828,7 +1829,7 @@
             <w:fldChar w:fldCharType="begin"/>
           </w:r>
           <w:r>
-            <w:instrText xml:space="preserve"> HYPERLINK \l _Toc18266 </w:instrText>
+            <w:instrText xml:space="preserve"> HYPERLINK \l _Toc6785 </w:instrText>
           </w:r>
           <w:r>
             <w:fldChar w:fldCharType="separate"/>
@@ -1846,7 +1847,7 @@
             <w:fldChar w:fldCharType="begin"/>
           </w:r>
           <w:r>
-            <w:instrText xml:space="preserve"> PAGEREF _Toc18266 \h </w:instrText>
+            <w:instrText xml:space="preserve"> PAGEREF _Toc6785 \h </w:instrText>
           </w:r>
           <w:r>
             <w:fldChar w:fldCharType="separate"/>
@@ -1873,7 +1874,7 @@
             <w:fldChar w:fldCharType="begin"/>
           </w:r>
           <w:r>
-            <w:instrText xml:space="preserve"> HYPERLINK \l _Toc15251 </w:instrText>
+            <w:instrText xml:space="preserve"> HYPERLINK \l _Toc8530 </w:instrText>
           </w:r>
           <w:r>
             <w:fldChar w:fldCharType="separate"/>
@@ -1891,7 +1892,7 @@
             <w:fldChar w:fldCharType="begin"/>
           </w:r>
           <w:r>
-            <w:instrText xml:space="preserve"> PAGEREF _Toc15251 \h </w:instrText>
+            <w:instrText xml:space="preserve"> PAGEREF _Toc8530 \h </w:instrText>
           </w:r>
           <w:r>
             <w:fldChar w:fldCharType="separate"/>
@@ -1918,7 +1919,7 @@
             <w:fldChar w:fldCharType="begin"/>
           </w:r>
           <w:r>
-            <w:instrText xml:space="preserve"> HYPERLINK \l _Toc18822 </w:instrText>
+            <w:instrText xml:space="preserve"> HYPERLINK \l _Toc31108 </w:instrText>
           </w:r>
           <w:r>
             <w:fldChar w:fldCharType="separate"/>
@@ -1936,7 +1937,7 @@
             <w:fldChar w:fldCharType="begin"/>
           </w:r>
           <w:r>
-            <w:instrText xml:space="preserve"> PAGEREF _Toc18822 \h </w:instrText>
+            <w:instrText xml:space="preserve"> PAGEREF _Toc31108 \h </w:instrText>
           </w:r>
           <w:r>
             <w:fldChar w:fldCharType="separate"/>
@@ -1963,7 +1964,7 @@
             <w:fldChar w:fldCharType="begin"/>
           </w:r>
           <w:r>
-            <w:instrText xml:space="preserve"> HYPERLINK \l _Toc393 </w:instrText>
+            <w:instrText xml:space="preserve"> HYPERLINK \l _Toc4459 </w:instrText>
           </w:r>
           <w:r>
             <w:fldChar w:fldCharType="separate"/>
@@ -1981,7 +1982,7 @@
             <w:fldChar w:fldCharType="begin"/>
           </w:r>
           <w:r>
-            <w:instrText xml:space="preserve"> PAGEREF _Toc393 \h </w:instrText>
+            <w:instrText xml:space="preserve"> PAGEREF _Toc4459 \h </w:instrText>
           </w:r>
           <w:r>
             <w:fldChar w:fldCharType="separate"/>
@@ -2008,7 +2009,7 @@
             <w:fldChar w:fldCharType="begin"/>
           </w:r>
           <w:r>
-            <w:instrText xml:space="preserve"> HYPERLINK \l _Toc3810 </w:instrText>
+            <w:instrText xml:space="preserve"> HYPERLINK \l _Toc29938 </w:instrText>
           </w:r>
           <w:r>
             <w:fldChar w:fldCharType="separate"/>
@@ -2026,7 +2027,7 @@
             <w:fldChar w:fldCharType="begin"/>
           </w:r>
           <w:r>
-            <w:instrText xml:space="preserve"> PAGEREF _Toc3810 \h </w:instrText>
+            <w:instrText xml:space="preserve"> PAGEREF _Toc29938 \h </w:instrText>
           </w:r>
           <w:r>
             <w:fldChar w:fldCharType="separate"/>
@@ -2049,7 +2050,7 @@
             <w:fldChar w:fldCharType="begin"/>
           </w:r>
           <w:r>
-            <w:instrText xml:space="preserve"> HYPERLINK \l _Toc30176 </w:instrText>
+            <w:instrText xml:space="preserve"> HYPERLINK \l _Toc25238 </w:instrText>
           </w:r>
           <w:r>
             <w:fldChar w:fldCharType="separate"/>
@@ -2067,7 +2068,7 @@
             <w:fldChar w:fldCharType="begin"/>
           </w:r>
           <w:r>
-            <w:instrText xml:space="preserve"> PAGEREF _Toc30176 \h </w:instrText>
+            <w:instrText xml:space="preserve"> PAGEREF _Toc25238 \h </w:instrText>
           </w:r>
           <w:r>
             <w:fldChar w:fldCharType="separate"/>
@@ -2094,7 +2095,7 @@
             <w:fldChar w:fldCharType="begin"/>
           </w:r>
           <w:r>
-            <w:instrText xml:space="preserve"> HYPERLINK \l _Toc17975 </w:instrText>
+            <w:instrText xml:space="preserve"> HYPERLINK \l _Toc17205 </w:instrText>
           </w:r>
           <w:r>
             <w:fldChar w:fldCharType="separate"/>
@@ -2112,7 +2113,7 @@
             <w:fldChar w:fldCharType="begin"/>
           </w:r>
           <w:r>
-            <w:instrText xml:space="preserve"> PAGEREF _Toc17975 \h </w:instrText>
+            <w:instrText xml:space="preserve"> PAGEREF _Toc17205 \h </w:instrText>
           </w:r>
           <w:r>
             <w:fldChar w:fldCharType="separate"/>
@@ -2139,7 +2140,7 @@
             <w:fldChar w:fldCharType="begin"/>
           </w:r>
           <w:r>
-            <w:instrText xml:space="preserve"> HYPERLINK \l _Toc28139 </w:instrText>
+            <w:instrText xml:space="preserve"> HYPERLINK \l _Toc3622 </w:instrText>
           </w:r>
           <w:r>
             <w:fldChar w:fldCharType="separate"/>
@@ -2157,7 +2158,7 @@
             <w:fldChar w:fldCharType="begin"/>
           </w:r>
           <w:r>
-            <w:instrText xml:space="preserve"> PAGEREF _Toc28139 \h </w:instrText>
+            <w:instrText xml:space="preserve"> PAGEREF _Toc3622 \h </w:instrText>
           </w:r>
           <w:r>
             <w:fldChar w:fldCharType="separate"/>
@@ -2184,7 +2185,7 @@
             <w:fldChar w:fldCharType="begin"/>
           </w:r>
           <w:r>
-            <w:instrText xml:space="preserve"> HYPERLINK \l _Toc29333 </w:instrText>
+            <w:instrText xml:space="preserve"> HYPERLINK \l _Toc27290 </w:instrText>
           </w:r>
           <w:r>
             <w:fldChar w:fldCharType="separate"/>
@@ -2202,7 +2203,7 @@
             <w:fldChar w:fldCharType="begin"/>
           </w:r>
           <w:r>
-            <w:instrText xml:space="preserve"> PAGEREF _Toc29333 \h </w:instrText>
+            <w:instrText xml:space="preserve"> PAGEREF _Toc27290 \h </w:instrText>
           </w:r>
           <w:r>
             <w:fldChar w:fldCharType="separate"/>
@@ -2229,7 +2230,7 @@
             <w:fldChar w:fldCharType="begin"/>
           </w:r>
           <w:r>
-            <w:instrText xml:space="preserve"> HYPERLINK \l _Toc24436 </w:instrText>
+            <w:instrText xml:space="preserve"> HYPERLINK \l _Toc21076 </w:instrText>
           </w:r>
           <w:r>
             <w:fldChar w:fldCharType="separate"/>
@@ -2247,7 +2248,7 @@
             <w:fldChar w:fldCharType="begin"/>
           </w:r>
           <w:r>
-            <w:instrText xml:space="preserve"> PAGEREF _Toc24436 \h </w:instrText>
+            <w:instrText xml:space="preserve"> PAGEREF _Toc21076 \h </w:instrText>
           </w:r>
           <w:r>
             <w:fldChar w:fldCharType="separate"/>
@@ -2274,7 +2275,7 @@
             <w:fldChar w:fldCharType="begin"/>
           </w:r>
           <w:r>
-            <w:instrText xml:space="preserve"> HYPERLINK \l _Toc7596 </w:instrText>
+            <w:instrText xml:space="preserve"> HYPERLINK \l _Toc17684 </w:instrText>
           </w:r>
           <w:r>
             <w:fldChar w:fldCharType="separate"/>
@@ -2292,7 +2293,7 @@
             <w:fldChar w:fldCharType="begin"/>
           </w:r>
           <w:r>
-            <w:instrText xml:space="preserve"> PAGEREF _Toc7596 \h </w:instrText>
+            <w:instrText xml:space="preserve"> PAGEREF _Toc17684 \h </w:instrText>
           </w:r>
           <w:r>
             <w:fldChar w:fldCharType="separate"/>
@@ -2315,7 +2316,7 @@
             <w:fldChar w:fldCharType="begin"/>
           </w:r>
           <w:r>
-            <w:instrText xml:space="preserve"> HYPERLINK \l _Toc13369 </w:instrText>
+            <w:instrText xml:space="preserve"> HYPERLINK \l _Toc19327 </w:instrText>
           </w:r>
           <w:r>
             <w:fldChar w:fldCharType="separate"/>
@@ -2333,7 +2334,7 @@
             <w:fldChar w:fldCharType="begin"/>
           </w:r>
           <w:r>
-            <w:instrText xml:space="preserve"> PAGEREF _Toc13369 \h </w:instrText>
+            <w:instrText xml:space="preserve"> PAGEREF _Toc19327 \h </w:instrText>
           </w:r>
           <w:r>
             <w:fldChar w:fldCharType="separate"/>
@@ -2360,7 +2361,7 @@
             <w:fldChar w:fldCharType="begin"/>
           </w:r>
           <w:r>
-            <w:instrText xml:space="preserve"> HYPERLINK \l _Toc7655 </w:instrText>
+            <w:instrText xml:space="preserve"> HYPERLINK \l _Toc18157 </w:instrText>
           </w:r>
           <w:r>
             <w:fldChar w:fldCharType="separate"/>
@@ -2378,7 +2379,7 @@
             <w:fldChar w:fldCharType="begin"/>
           </w:r>
           <w:r>
-            <w:instrText xml:space="preserve"> PAGEREF _Toc7655 \h </w:instrText>
+            <w:instrText xml:space="preserve"> PAGEREF _Toc18157 \h </w:instrText>
           </w:r>
           <w:r>
             <w:fldChar w:fldCharType="separate"/>
@@ -2405,7 +2406,7 @@
             <w:fldChar w:fldCharType="begin"/>
           </w:r>
           <w:r>
-            <w:instrText xml:space="preserve"> HYPERLINK \l _Toc13838 </w:instrText>
+            <w:instrText xml:space="preserve"> HYPERLINK \l _Toc26757 </w:instrText>
           </w:r>
           <w:r>
             <w:fldChar w:fldCharType="separate"/>
@@ -2423,7 +2424,7 @@
             <w:fldChar w:fldCharType="begin"/>
           </w:r>
           <w:r>
-            <w:instrText xml:space="preserve"> PAGEREF _Toc13838 \h </w:instrText>
+            <w:instrText xml:space="preserve"> PAGEREF _Toc26757 \h </w:instrText>
           </w:r>
           <w:r>
             <w:fldChar w:fldCharType="separate"/>
@@ -2446,7 +2447,7 @@
             <w:fldChar w:fldCharType="begin"/>
           </w:r>
           <w:r>
-            <w:instrText xml:space="preserve"> HYPERLINK \l _Toc5754 </w:instrText>
+            <w:instrText xml:space="preserve"> HYPERLINK \l _Toc18502 </w:instrText>
           </w:r>
           <w:r>
             <w:fldChar w:fldCharType="separate"/>
@@ -2464,7 +2465,7 @@
             <w:fldChar w:fldCharType="begin"/>
           </w:r>
           <w:r>
-            <w:instrText xml:space="preserve"> PAGEREF _Toc5754 \h </w:instrText>
+            <w:instrText xml:space="preserve"> PAGEREF _Toc18502 \h </w:instrText>
           </w:r>
           <w:r>
             <w:fldChar w:fldCharType="separate"/>
@@ -2487,7 +2488,7 @@
             <w:fldChar w:fldCharType="begin"/>
           </w:r>
           <w:r>
-            <w:instrText xml:space="preserve"> HYPERLINK \l _Toc16703 </w:instrText>
+            <w:instrText xml:space="preserve"> HYPERLINK \l _Toc6871 </w:instrText>
           </w:r>
           <w:r>
             <w:fldChar w:fldCharType="separate"/>
@@ -2505,7 +2506,7 @@
             <w:fldChar w:fldCharType="begin"/>
           </w:r>
           <w:r>
-            <w:instrText xml:space="preserve"> PAGEREF _Toc16703 \h </w:instrText>
+            <w:instrText xml:space="preserve"> PAGEREF _Toc6871 \h </w:instrText>
           </w:r>
           <w:r>
             <w:fldChar w:fldCharType="separate"/>
@@ -2528,7 +2529,7 @@
             <w:fldChar w:fldCharType="begin"/>
           </w:r>
           <w:r>
-            <w:instrText xml:space="preserve"> HYPERLINK \l _Toc18627 </w:instrText>
+            <w:instrText xml:space="preserve"> HYPERLINK \l _Toc20310 </w:instrText>
           </w:r>
           <w:r>
             <w:fldChar w:fldCharType="separate"/>
@@ -2546,7 +2547,7 @@
             <w:fldChar w:fldCharType="begin"/>
           </w:r>
           <w:r>
-            <w:instrText xml:space="preserve"> PAGEREF _Toc18627 \h </w:instrText>
+            <w:instrText xml:space="preserve"> PAGEREF _Toc20310 \h </w:instrText>
           </w:r>
           <w:r>
             <w:fldChar w:fldCharType="separate"/>
@@ -2569,7 +2570,7 @@
             <w:fldChar w:fldCharType="begin"/>
           </w:r>
           <w:r>
-            <w:instrText xml:space="preserve"> HYPERLINK \l _Toc5874 </w:instrText>
+            <w:instrText xml:space="preserve"> HYPERLINK \l _Toc26675 </w:instrText>
           </w:r>
           <w:r>
             <w:fldChar w:fldCharType="separate"/>
@@ -2587,7 +2588,7 @@
             <w:fldChar w:fldCharType="begin"/>
           </w:r>
           <w:r>
-            <w:instrText xml:space="preserve"> PAGEREF _Toc5874 \h </w:instrText>
+            <w:instrText xml:space="preserve"> PAGEREF _Toc26675 \h </w:instrText>
           </w:r>
           <w:r>
             <w:fldChar w:fldCharType="separate"/>
@@ -2614,7 +2615,7 @@
             <w:fldChar w:fldCharType="begin"/>
           </w:r>
           <w:r>
-            <w:instrText xml:space="preserve"> HYPERLINK \l _Toc18849 </w:instrText>
+            <w:instrText xml:space="preserve"> HYPERLINK \l _Toc2493 </w:instrText>
           </w:r>
           <w:r>
             <w:fldChar w:fldCharType="separate"/>
@@ -2632,7 +2633,7 @@
             <w:fldChar w:fldCharType="begin"/>
           </w:r>
           <w:r>
-            <w:instrText xml:space="preserve"> PAGEREF _Toc18849 \h </w:instrText>
+            <w:instrText xml:space="preserve"> PAGEREF _Toc2493 \h </w:instrText>
           </w:r>
           <w:r>
             <w:fldChar w:fldCharType="separate"/>
@@ -2659,7 +2660,7 @@
             <w:fldChar w:fldCharType="begin"/>
           </w:r>
           <w:r>
-            <w:instrText xml:space="preserve"> HYPERLINK \l _Toc14225 </w:instrText>
+            <w:instrText xml:space="preserve"> HYPERLINK \l _Toc29483 </w:instrText>
           </w:r>
           <w:r>
             <w:fldChar w:fldCharType="separate"/>
@@ -2677,7 +2678,7 @@
             <w:fldChar w:fldCharType="begin"/>
           </w:r>
           <w:r>
-            <w:instrText xml:space="preserve"> PAGEREF _Toc14225 \h </w:instrText>
+            <w:instrText xml:space="preserve"> PAGEREF _Toc29483 \h </w:instrText>
           </w:r>
           <w:r>
             <w:fldChar w:fldCharType="separate"/>
@@ -2704,7 +2705,7 @@
             <w:fldChar w:fldCharType="begin"/>
           </w:r>
           <w:r>
-            <w:instrText xml:space="preserve"> HYPERLINK \l _Toc698 </w:instrText>
+            <w:instrText xml:space="preserve"> HYPERLINK \l _Toc21872 </w:instrText>
           </w:r>
           <w:r>
             <w:fldChar w:fldCharType="separate"/>
@@ -2722,7 +2723,7 @@
             <w:fldChar w:fldCharType="begin"/>
           </w:r>
           <w:r>
-            <w:instrText xml:space="preserve"> PAGEREF _Toc698 \h </w:instrText>
+            <w:instrText xml:space="preserve"> PAGEREF _Toc21872 \h </w:instrText>
           </w:r>
           <w:r>
             <w:fldChar w:fldCharType="separate"/>
@@ -2745,7 +2746,7 @@
             <w:fldChar w:fldCharType="begin"/>
           </w:r>
           <w:r>
-            <w:instrText xml:space="preserve"> HYPERLINK \l _Toc11651 </w:instrText>
+            <w:instrText xml:space="preserve"> HYPERLINK \l _Toc30943 </w:instrText>
           </w:r>
           <w:r>
             <w:fldChar w:fldCharType="separate"/>
@@ -2763,7 +2764,7 @@
             <w:fldChar w:fldCharType="begin"/>
           </w:r>
           <w:r>
-            <w:instrText xml:space="preserve"> PAGEREF _Toc11651 \h </w:instrText>
+            <w:instrText xml:space="preserve"> PAGEREF _Toc30943 \h </w:instrText>
           </w:r>
           <w:r>
             <w:fldChar w:fldCharType="separate"/>
@@ -2790,7 +2791,7 @@
             <w:fldChar w:fldCharType="begin"/>
           </w:r>
           <w:r>
-            <w:instrText xml:space="preserve"> HYPERLINK \l _Toc26313 </w:instrText>
+            <w:instrText xml:space="preserve"> HYPERLINK \l _Toc32265 </w:instrText>
           </w:r>
           <w:r>
             <w:fldChar w:fldCharType="separate"/>
@@ -2808,7 +2809,7 @@
             <w:fldChar w:fldCharType="begin"/>
           </w:r>
           <w:r>
-            <w:instrText xml:space="preserve"> PAGEREF _Toc26313 \h </w:instrText>
+            <w:instrText xml:space="preserve"> PAGEREF _Toc32265 \h </w:instrText>
           </w:r>
           <w:r>
             <w:fldChar w:fldCharType="separate"/>
@@ -2835,7 +2836,7 @@
             <w:fldChar w:fldCharType="begin"/>
           </w:r>
           <w:r>
-            <w:instrText xml:space="preserve"> HYPERLINK \l _Toc12996 </w:instrText>
+            <w:instrText xml:space="preserve"> HYPERLINK \l _Toc30103 </w:instrText>
           </w:r>
           <w:r>
             <w:fldChar w:fldCharType="separate"/>
@@ -2853,7 +2854,7 @@
             <w:fldChar w:fldCharType="begin"/>
           </w:r>
           <w:r>
-            <w:instrText xml:space="preserve"> PAGEREF _Toc12996 \h </w:instrText>
+            <w:instrText xml:space="preserve"> PAGEREF _Toc30103 \h </w:instrText>
           </w:r>
           <w:r>
             <w:fldChar w:fldCharType="separate"/>
@@ -2870,10 +2871,10 @@
         </w:p>
         <w:p>
           <w:pPr>
-            <w:pStyle w:val="26"/>
+            <w:pStyle w:val="32"/>
             <w:tabs>
               <w:tab w:val="right" w:leader="dot" w:pos="9070"/>
-              <w:tab w:val="clear" w:pos="9071"/>
+              <w:tab w:val="clear" w:pos="8788"/>
             </w:tabs>
           </w:pPr>
           <w:r>
@@ -2928,7 +2929,7 @@
         <w:ind w:firstLine="0"/>
         <w:jc w:val="center"/>
       </w:pPr>
-      <w:bookmarkStart w:id="1" w:name="_Toc12533"/>
+      <w:bookmarkStart w:id="1" w:name="_Toc1732"/>
       <w:r>
         <w:rPr>
           <w:rFonts w:ascii="Times New Roman" w:hAnsi="Times New Roman" w:eastAsia="黑体" w:cs="黑体"/>
@@ -3045,7 +3046,7 @@
         <w:ind w:firstLine="0"/>
         <w:jc w:val="center"/>
       </w:pPr>
-      <w:bookmarkStart w:id="2" w:name="_Toc14575"/>
+      <w:bookmarkStart w:id="2" w:name="_Toc3905"/>
       <w:r>
         <w:rPr>
           <w:rFonts w:ascii="Times New Roman" w:hAnsi="Times New Roman" w:eastAsia="Times New Roman" w:cs="Times New Roman"/>
@@ -3152,7 +3153,7 @@
         <w:ind w:firstLine="0"/>
         <w:jc w:val="center"/>
       </w:pPr>
-      <w:bookmarkStart w:id="3" w:name="_Toc1850"/>
+      <w:bookmarkStart w:id="3" w:name="_Toc3871"/>
       <w:r>
         <w:rPr>
           <w:rFonts w:ascii="Times New Roman" w:hAnsi="Times New Roman" w:eastAsia="黑体" w:cs="黑体"/>
@@ -3171,7 +3172,7 @@
         <w:ind w:firstLine="480"/>
         <w:jc w:val="left"/>
       </w:pPr>
-      <w:bookmarkStart w:id="4" w:name="_Toc14878"/>
+      <w:bookmarkStart w:id="4" w:name="_Toc3000"/>
       <w:r>
         <w:rPr>
           <w:rFonts w:ascii="Times New Roman" w:hAnsi="Times New Roman" w:eastAsia="黑体" w:cs="黑体"/>
@@ -3254,7 +3255,7 @@
         <w:ind w:firstLine="480"/>
         <w:jc w:val="left"/>
       </w:pPr>
-      <w:bookmarkStart w:id="5" w:name="_Toc5848"/>
+      <w:bookmarkStart w:id="5" w:name="_Toc2242"/>
       <w:r>
         <w:rPr>
           <w:rFonts w:ascii="Times New Roman" w:hAnsi="Times New Roman" w:eastAsia="黑体" w:cs="黑体"/>
@@ -3385,7 +3386,7 @@
         <w:ind w:firstLine="480"/>
         <w:jc w:val="left"/>
       </w:pPr>
-      <w:bookmarkStart w:id="6" w:name="_Toc29804"/>
+      <w:bookmarkStart w:id="6" w:name="_Toc17104"/>
       <w:r>
         <w:rPr>
           <w:rFonts w:ascii="Times New Roman" w:hAnsi="Times New Roman" w:eastAsia="黑体" w:cs="黑体"/>
@@ -3436,7 +3437,7 @@
         <w:ind w:firstLine="480"/>
         <w:jc w:val="left"/>
       </w:pPr>
-      <w:bookmarkStart w:id="7" w:name="_Toc17559"/>
+      <w:bookmarkStart w:id="7" w:name="_Toc9234"/>
       <w:r>
         <w:rPr>
           <w:rFonts w:ascii="Times New Roman" w:hAnsi="Times New Roman" w:eastAsia="黑体" w:cs="黑体"/>
@@ -3481,7 +3482,7 @@
         <w:ind w:firstLine="0"/>
         <w:jc w:val="center"/>
       </w:pPr>
-      <w:bookmarkStart w:id="8" w:name="_Toc3282"/>
+      <w:bookmarkStart w:id="8" w:name="_Toc10552"/>
       <w:r>
         <w:rPr>
           <w:rFonts w:ascii="Times New Roman" w:hAnsi="Times New Roman" w:eastAsia="黑体" w:cs="黑体"/>
@@ -3500,7 +3501,7 @@
         <w:ind w:firstLine="480"/>
         <w:jc w:val="left"/>
       </w:pPr>
-      <w:bookmarkStart w:id="9" w:name="_Toc28570"/>
+      <w:bookmarkStart w:id="9" w:name="_Toc22900"/>
       <w:r>
         <w:rPr>
           <w:rFonts w:ascii="Times New Roman" w:hAnsi="Times New Roman" w:eastAsia="黑体" w:cs="黑体"/>
@@ -3583,7 +3584,7 @@
         <w:ind w:firstLine="480"/>
         <w:jc w:val="left"/>
       </w:pPr>
-      <w:bookmarkStart w:id="10" w:name="_Toc9163"/>
+      <w:bookmarkStart w:id="10" w:name="_Toc6761"/>
       <w:r>
         <w:rPr>
           <w:rFonts w:ascii="Times New Roman" w:hAnsi="Times New Roman" w:eastAsia="黑体" w:cs="黑体"/>
@@ -3666,7 +3667,7 @@
         <w:ind w:firstLine="480"/>
         <w:jc w:val="left"/>
       </w:pPr>
-      <w:bookmarkStart w:id="11" w:name="_Toc1223"/>
+      <w:bookmarkStart w:id="11" w:name="_Toc28794"/>
       <w:r>
         <w:rPr>
           <w:rFonts w:ascii="Times New Roman" w:hAnsi="Times New Roman" w:eastAsia="黑体" w:cs="黑体"/>
@@ -3733,7 +3734,7 @@
         <w:ind w:firstLine="480"/>
         <w:jc w:val="left"/>
       </w:pPr>
-      <w:bookmarkStart w:id="12" w:name="_Toc28567"/>
+      <w:bookmarkStart w:id="12" w:name="_Toc14760"/>
       <w:r>
         <w:rPr>
           <w:rFonts w:ascii="Times New Roman" w:hAnsi="Times New Roman" w:eastAsia="黑体" w:cs="黑体"/>
@@ -3816,7 +3817,7 @@
         <w:ind w:firstLine="480"/>
         <w:jc w:val="left"/>
       </w:pPr>
-      <w:bookmarkStart w:id="13" w:name="_Toc12941"/>
+      <w:bookmarkStart w:id="13" w:name="_Toc31084"/>
       <w:r>
         <w:rPr>
           <w:rFonts w:ascii="Times New Roman" w:hAnsi="Times New Roman" w:eastAsia="黑体" w:cs="黑体"/>
@@ -3900,7 +3901,7 @@
         <w:ind w:firstLine="0"/>
         <w:jc w:val="center"/>
       </w:pPr>
-      <w:bookmarkStart w:id="14" w:name="_Toc6505"/>
+      <w:bookmarkStart w:id="14" w:name="_Toc12263"/>
       <w:r>
         <w:rPr>
           <w:rFonts w:ascii="Times New Roman" w:hAnsi="Times New Roman" w:eastAsia="黑体" w:cs="黑体"/>
@@ -3919,7 +3920,7 @@
         <w:ind w:firstLine="480"/>
         <w:jc w:val="left"/>
       </w:pPr>
-      <w:bookmarkStart w:id="15" w:name="_Toc26570"/>
+      <w:bookmarkStart w:id="15" w:name="_Toc5140"/>
       <w:r>
         <w:rPr>
           <w:rFonts w:ascii="Times New Roman" w:hAnsi="Times New Roman" w:eastAsia="黑体" w:cs="黑体"/>
@@ -4152,7 +4153,7 @@
         <w:ind w:firstLine="480"/>
         <w:jc w:val="left"/>
       </w:pPr>
-      <w:bookmarkStart w:id="16" w:name="_Toc32060"/>
+      <w:bookmarkStart w:id="16" w:name="_Toc21982"/>
       <w:r>
         <w:rPr>
           <w:rFonts w:ascii="Times New Roman" w:hAnsi="Times New Roman" w:eastAsia="黑体" w:cs="黑体"/>
@@ -4219,7 +4220,7 @@
         <w:ind w:firstLine="480"/>
         <w:jc w:val="left"/>
       </w:pPr>
-      <w:bookmarkStart w:id="17" w:name="_Toc24277"/>
+      <w:bookmarkStart w:id="17" w:name="_Toc30205"/>
       <w:r>
         <w:rPr>
           <w:rFonts w:ascii="Times New Roman" w:hAnsi="Times New Roman" w:eastAsia="黑体" w:cs="黑体"/>
@@ -4394,7 +4395,7 @@
         <w:ind w:firstLine="480"/>
         <w:jc w:val="left"/>
       </w:pPr>
-      <w:bookmarkStart w:id="18" w:name="_Toc10536"/>
+      <w:bookmarkStart w:id="18" w:name="_Toc5083"/>
       <w:r>
         <w:rPr>
           <w:rFonts w:ascii="Times New Roman" w:hAnsi="Times New Roman" w:eastAsia="黑体" w:cs="黑体"/>
@@ -4563,7 +4564,7 @@
         <w:ind w:firstLine="0"/>
         <w:jc w:val="center"/>
       </w:pPr>
-      <w:bookmarkStart w:id="19" w:name="_Toc15876"/>
+      <w:bookmarkStart w:id="19" w:name="_Toc29565"/>
       <w:r>
         <w:rPr>
           <w:rFonts w:ascii="Times New Roman" w:hAnsi="Times New Roman" w:eastAsia="黑体" w:cs="黑体"/>
@@ -4582,7 +4583,7 @@
         <w:ind w:firstLine="480"/>
         <w:jc w:val="left"/>
       </w:pPr>
-      <w:bookmarkStart w:id="20" w:name="_Toc8291"/>
+      <w:bookmarkStart w:id="20" w:name="_Toc19732"/>
       <w:r>
         <w:rPr>
           <w:rFonts w:ascii="Times New Roman" w:hAnsi="Times New Roman" w:eastAsia="黑体" w:cs="黑体"/>
@@ -4649,7 +4650,7 @@
         <w:ind w:firstLine="480"/>
         <w:jc w:val="left"/>
       </w:pPr>
-      <w:bookmarkStart w:id="21" w:name="_Toc24861"/>
+      <w:bookmarkStart w:id="21" w:name="_Toc10822"/>
       <w:r>
         <w:rPr>
           <w:rFonts w:ascii="Times New Roman" w:hAnsi="Times New Roman" w:eastAsia="黑体" w:cs="黑体"/>
@@ -4716,7 +4717,7 @@
         <w:ind w:firstLine="480"/>
         <w:jc w:val="left"/>
       </w:pPr>
-      <w:bookmarkStart w:id="22" w:name="_Toc18266"/>
+      <w:bookmarkStart w:id="22" w:name="_Toc6785"/>
       <w:r>
         <w:rPr>
           <w:rFonts w:ascii="Times New Roman" w:hAnsi="Times New Roman" w:eastAsia="黑体" w:cs="黑体"/>
@@ -4815,7 +4816,7 @@
         <w:ind w:firstLine="480"/>
         <w:jc w:val="left"/>
       </w:pPr>
-      <w:bookmarkStart w:id="23" w:name="_Toc15251"/>
+      <w:bookmarkStart w:id="23" w:name="_Toc8530"/>
       <w:r>
         <w:rPr>
           <w:rFonts w:ascii="Times New Roman" w:hAnsi="Times New Roman" w:eastAsia="黑体" w:cs="黑体"/>
@@ -4882,7 +4883,7 @@
         <w:ind w:firstLine="480"/>
         <w:jc w:val="left"/>
       </w:pPr>
-      <w:bookmarkStart w:id="24" w:name="_Toc18822"/>
+      <w:bookmarkStart w:id="24" w:name="_Toc31108"/>
       <w:r>
         <w:rPr>
           <w:rFonts w:ascii="Times New Roman" w:hAnsi="Times New Roman" w:eastAsia="黑体" w:cs="黑体"/>
@@ -4981,7 +4982,7 @@
         <w:ind w:firstLine="480"/>
         <w:jc w:val="left"/>
       </w:pPr>
-      <w:bookmarkStart w:id="25" w:name="_Toc393"/>
+      <w:bookmarkStart w:id="25" w:name="_Toc4459"/>
       <w:r>
         <w:rPr>
           <w:rFonts w:ascii="Times New Roman" w:hAnsi="Times New Roman" w:eastAsia="黑体" w:cs="黑体"/>
@@ -5048,7 +5049,7 @@
         <w:ind w:firstLine="480"/>
         <w:jc w:val="left"/>
       </w:pPr>
-      <w:bookmarkStart w:id="26" w:name="_Toc3810"/>
+      <w:bookmarkStart w:id="26" w:name="_Toc29938"/>
       <w:r>
         <w:rPr>
           <w:rFonts w:ascii="Times New Roman" w:hAnsi="Times New Roman" w:eastAsia="黑体" w:cs="黑体"/>
@@ -5109,7 +5110,7 @@
         <w:ind w:firstLine="0"/>
         <w:jc w:val="center"/>
       </w:pPr>
-      <w:bookmarkStart w:id="27" w:name="_Toc30176"/>
+      <w:bookmarkStart w:id="27" w:name="_Toc25238"/>
       <w:r>
         <w:rPr>
           <w:rFonts w:ascii="Times New Roman" w:hAnsi="Times New Roman" w:eastAsia="黑体" w:cs="黑体"/>
@@ -5128,7 +5129,7 @@
         <w:ind w:firstLine="480"/>
         <w:jc w:val="left"/>
       </w:pPr>
-      <w:bookmarkStart w:id="28" w:name="_Toc17975"/>
+      <w:bookmarkStart w:id="28" w:name="_Toc17205"/>
       <w:r>
         <w:rPr>
           <w:rFonts w:ascii="Times New Roman" w:hAnsi="Times New Roman" w:eastAsia="黑体" w:cs="黑体"/>
@@ -5195,7 +5196,7 @@
         <w:ind w:firstLine="480"/>
         <w:jc w:val="left"/>
       </w:pPr>
-      <w:bookmarkStart w:id="29" w:name="_Toc28139"/>
+      <w:bookmarkStart w:id="29" w:name="_Toc3622"/>
       <w:r>
         <w:rPr>
           <w:rFonts w:ascii="Times New Roman" w:hAnsi="Times New Roman" w:eastAsia="黑体" w:cs="黑体"/>
@@ -5691,12 +5692,11 @@
             </w:pPr>
             <w:r>
               <w:rPr>
-                <w:rFonts w:ascii="Times New Roman" w:hAnsi="Times New Roman" w:eastAsia="宋体" w:cs="宋体"/>
-                <w:b w:val="0"/>
-                <w:color w:val="000000"/>
+                <w:rFonts w:hint="eastAsia"/>
                 <w:sz w:val="21"/>
+                <w:szCs w:val="21"/>
               </w:rPr>
-              <w:t>v22.15.1</w:t>
+              <w:t>v24.15.0</w:t>
             </w:r>
           </w:p>
         </w:tc>
@@ -5991,7 +5991,7 @@
         <w:ind w:firstLine="480"/>
         <w:jc w:val="left"/>
       </w:pPr>
-      <w:bookmarkStart w:id="30" w:name="_Toc29333"/>
+      <w:bookmarkStart w:id="30" w:name="_Toc27290"/>
       <w:r>
         <w:rPr>
           <w:rFonts w:ascii="Times New Roman" w:hAnsi="Times New Roman" w:eastAsia="黑体" w:cs="黑体"/>
@@ -8112,7 +8112,7 @@
         <w:ind w:firstLine="480"/>
         <w:jc w:val="left"/>
       </w:pPr>
-      <w:bookmarkStart w:id="31" w:name="_Toc24436"/>
+      <w:bookmarkStart w:id="31" w:name="_Toc21076"/>
       <w:r>
         <w:rPr>
           <w:rFonts w:ascii="Times New Roman" w:hAnsi="Times New Roman" w:eastAsia="黑体" w:cs="黑体"/>
@@ -8668,7 +8668,7 @@
         <w:ind w:firstLine="480"/>
         <w:jc w:val="left"/>
       </w:pPr>
-      <w:bookmarkStart w:id="32" w:name="_Toc7596"/>
+      <w:bookmarkStart w:id="32" w:name="_Toc17684"/>
       <w:r>
         <w:rPr>
           <w:rFonts w:ascii="Times New Roman" w:hAnsi="Times New Roman" w:eastAsia="黑体" w:cs="黑体"/>
@@ -8745,7 +8745,7 @@
         <w:ind w:firstLine="0"/>
         <w:jc w:val="center"/>
       </w:pPr>
-      <w:bookmarkStart w:id="33" w:name="_Toc13369"/>
+      <w:bookmarkStart w:id="33" w:name="_Toc19327"/>
       <w:r>
         <w:rPr>
           <w:rFonts w:ascii="Times New Roman" w:hAnsi="Times New Roman" w:eastAsia="黑体" w:cs="黑体"/>
@@ -8764,7 +8764,7 @@
         <w:ind w:firstLine="480"/>
         <w:jc w:val="left"/>
       </w:pPr>
-      <w:bookmarkStart w:id="34" w:name="_Toc7655"/>
+      <w:bookmarkStart w:id="34" w:name="_Toc18157"/>
       <w:r>
         <w:rPr>
           <w:rFonts w:ascii="Times New Roman" w:hAnsi="Times New Roman" w:eastAsia="黑体" w:cs="黑体"/>
@@ -8815,7 +8815,7 @@
         <w:ind w:firstLine="480"/>
         <w:jc w:val="left"/>
       </w:pPr>
-      <w:bookmarkStart w:id="35" w:name="_Toc13838"/>
+      <w:bookmarkStart w:id="35" w:name="_Toc26757"/>
       <w:r>
         <w:rPr>
           <w:rFonts w:ascii="Times New Roman" w:hAnsi="Times New Roman" w:eastAsia="黑体" w:cs="黑体"/>
@@ -8876,7 +8876,7 @@
         <w:ind w:firstLine="0"/>
         <w:jc w:val="center"/>
       </w:pPr>
-      <w:bookmarkStart w:id="36" w:name="_Toc5754"/>
+      <w:bookmarkStart w:id="36" w:name="_Toc18502"/>
       <w:r>
         <w:rPr>
           <w:rFonts w:ascii="Times New Roman" w:hAnsi="Times New Roman" w:eastAsia="黑体" w:cs="黑体"/>
@@ -9232,7 +9232,7 @@
         <w:ind w:firstLine="0"/>
         <w:jc w:val="center"/>
       </w:pPr>
-      <w:bookmarkStart w:id="37" w:name="_Toc16703"/>
+      <w:bookmarkStart w:id="37" w:name="_Toc6871"/>
       <w:r>
         <w:rPr>
           <w:rFonts w:ascii="Times New Roman" w:hAnsi="Times New Roman" w:eastAsia="黑体" w:cs="黑体"/>
@@ -9277,7 +9277,7 @@
         <w:ind w:firstLine="0"/>
         <w:jc w:val="center"/>
       </w:pPr>
-      <w:bookmarkStart w:id="38" w:name="_Toc18627"/>
+      <w:bookmarkStart w:id="38" w:name="_Toc20310"/>
       <w:r>
         <w:rPr>
           <w:rFonts w:ascii="Times New Roman" w:hAnsi="Times New Roman" w:eastAsia="黑体" w:cs="黑体"/>
@@ -9364,8 +9364,6 @@
         </w:rPr>
         <w:t>附图 A.1 登录页面</w:t>
       </w:r>
-      <w:bookmarkStart w:id="46" w:name="_GoBack"/>
-      <w:bookmarkEnd w:id="46"/>
     </w:p>
     <w:p>
       <w:pPr>
@@ -9682,7 +9680,7 @@
         <w:ind w:firstLine="0"/>
         <w:jc w:val="center"/>
       </w:pPr>
-      <w:bookmarkStart w:id="39" w:name="_Toc5874"/>
+      <w:bookmarkStart w:id="39" w:name="_Toc26675"/>
       <w:r>
         <w:rPr>
           <w:rFonts w:ascii="Times New Roman" w:hAnsi="Times New Roman" w:eastAsia="黑体" w:cs="黑体"/>
@@ -9717,7 +9715,7 @@
         <w:ind w:firstLine="480"/>
         <w:jc w:val="left"/>
       </w:pPr>
-      <w:bookmarkStart w:id="40" w:name="_Toc18849"/>
+      <w:bookmarkStart w:id="40" w:name="_Toc2493"/>
       <w:r>
         <w:rPr>
           <w:rFonts w:ascii="Times New Roman" w:hAnsi="Times New Roman" w:eastAsia="黑体" w:cs="黑体"/>
@@ -9890,7 +9888,7 @@
         <w:ind w:firstLine="480"/>
         <w:jc w:val="left"/>
       </w:pPr>
-      <w:bookmarkStart w:id="41" w:name="_Toc14225"/>
+      <w:bookmarkStart w:id="41" w:name="_Toc29483"/>
       <w:r>
         <w:rPr>
           <w:rFonts w:ascii="Times New Roman" w:hAnsi="Times New Roman" w:eastAsia="黑体" w:cs="黑体"/>
@@ -10041,7 +10039,7 @@
         <w:ind w:firstLine="480"/>
         <w:jc w:val="left"/>
       </w:pPr>
-      <w:bookmarkStart w:id="42" w:name="_Toc698"/>
+      <w:bookmarkStart w:id="42" w:name="_Toc21872"/>
       <w:r>
         <w:rPr>
           <w:rFonts w:ascii="Times New Roman" w:hAnsi="Times New Roman" w:eastAsia="黑体" w:cs="黑体"/>
@@ -10171,7 +10169,7 @@
         <w:ind w:firstLine="0"/>
         <w:jc w:val="center"/>
       </w:pPr>
-      <w:bookmarkStart w:id="43" w:name="_Toc11651"/>
+      <w:bookmarkStart w:id="43" w:name="_Toc30943"/>
       <w:r>
         <w:rPr>
           <w:rFonts w:ascii="Times New Roman" w:hAnsi="Times New Roman" w:eastAsia="黑体" w:cs="黑体"/>
@@ -10206,7 +10204,7 @@
         <w:ind w:firstLine="480"/>
         <w:jc w:val="left"/>
       </w:pPr>
-      <w:bookmarkStart w:id="44" w:name="_Toc26313"/>
+      <w:bookmarkStart w:id="44" w:name="_Toc32265"/>
       <w:r>
         <w:rPr>
           <w:rFonts w:ascii="Times New Roman" w:hAnsi="Times New Roman" w:eastAsia="黑体" w:cs="黑体"/>
@@ -10225,7 +10223,7 @@
         <w:ind w:firstLine="480"/>
         <w:jc w:val="left"/>
       </w:pPr>
-      <w:bookmarkStart w:id="45" w:name="_Toc12996"/>
+      <w:bookmarkStart w:id="45" w:name="_Toc30103"/>
       <w:r>
         <w:rPr>
           <w:rFonts w:ascii="Times New Roman" w:hAnsi="Times New Roman" w:eastAsia="黑体" w:cs="黑体"/>
@@ -10413,6 +10411,7 @@
         <w:t>PDF 上传/解析耗时为 Demo 模式下接口耗时，真实模式会额外受到 PDFBox 与 LLM 解析耗时影响。</w:t>
       </w:r>
     </w:p>
+    <w:bookmarkEnd w:id="46"/>
     <w:sectPr>
       <w:headerReference r:id="rId17" w:type="first"/>
       <w:footerReference r:id="rId20" w:type="first"/>

</xml_diff>